<commit_message>
Manuscript revisions round 2
</commit_message>
<xml_diff>
--- a/docs/manuscript.docx
+++ b/docs/manuscript.docx
@@ -7,7 +7,91 @@
         <w:pStyle w:val="Title"/>
       </w:pPr>
       <w:r>
-        <w:t xml:space="preserve">Using GPT-4 to annotate the severity of all phenotypic abnormalities within the Human Phenotype Ontology</w:t>
+        <w:t xml:space="preserve">Using</w:t>
+      </w:r>
+      <w:r>
+        <w:t xml:space="preserve"> </w:t>
+      </w:r>
+      <w:r>
+        <w:t xml:space="preserve">GPT-4</w:t>
+      </w:r>
+      <w:r>
+        <w:t xml:space="preserve"> </w:t>
+      </w:r>
+      <w:r>
+        <w:t xml:space="preserve">to</w:t>
+      </w:r>
+      <w:r>
+        <w:t xml:space="preserve"> </w:t>
+      </w:r>
+      <w:r>
+        <w:t xml:space="preserve">annotate</w:t>
+      </w:r>
+      <w:r>
+        <w:t xml:space="preserve"> </w:t>
+      </w:r>
+      <w:r>
+        <w:t xml:space="preserve">the</w:t>
+      </w:r>
+      <w:r>
+        <w:t xml:space="preserve"> </w:t>
+      </w:r>
+      <w:r>
+        <w:t xml:space="preserve">severity</w:t>
+      </w:r>
+      <w:r>
+        <w:t xml:space="preserve"> </w:t>
+      </w:r>
+      <w:r>
+        <w:t xml:space="preserve">of</w:t>
+      </w:r>
+      <w:r>
+        <w:t xml:space="preserve"> </w:t>
+      </w:r>
+      <w:r>
+        <w:t xml:space="preserve">all</w:t>
+      </w:r>
+      <w:r>
+        <w:t xml:space="preserve"> </w:t>
+      </w:r>
+      <w:r>
+        <w:t xml:space="preserve">phenotypic</w:t>
+      </w:r>
+      <w:r>
+        <w:t xml:space="preserve"> </w:t>
+      </w:r>
+      <w:r>
+        <w:t xml:space="preserve">abnormalities</w:t>
+      </w:r>
+      <w:r>
+        <w:t xml:space="preserve"> </w:t>
+      </w:r>
+      <w:r>
+        <w:t xml:space="preserve">within</w:t>
+      </w:r>
+      <w:r>
+        <w:t xml:space="preserve"> </w:t>
+      </w:r>
+      <w:r>
+        <w:t xml:space="preserve">the</w:t>
+      </w:r>
+      <w:r>
+        <w:t xml:space="preserve"> </w:t>
+      </w:r>
+      <w:r>
+        <w:t xml:space="preserve">Human</w:t>
+      </w:r>
+      <w:r>
+        <w:t xml:space="preserve"> </w:t>
+      </w:r>
+      <w:r>
+        <w:t xml:space="preserve">Phenotype</w:t>
+      </w:r>
+      <w:r>
+        <w:t xml:space="preserve"> </w:t>
+      </w:r>
+      <w:r>
+        <w:t xml:space="preserve">Ontology</w:t>
       </w:r>
     </w:p>
     <w:p>
@@ -15,7 +99,19 @@
         <w:pStyle w:val="Author"/>
       </w:pPr>
       <w:r>
-        <w:t xml:space="preserve">Kitty B Murphy</w:t>
+        <w:t xml:space="preserve">Kitty</w:t>
+      </w:r>
+      <w:r>
+        <w:t xml:space="preserve"> </w:t>
+      </w:r>
+      <w:r>
+        <w:t xml:space="preserve">B</w:t>
+      </w:r>
+      <w:r>
+        <w:t xml:space="preserve"> </w:t>
+      </w:r>
+      <w:r>
+        <w:t xml:space="preserve">Murphy</w:t>
       </w:r>
     </w:p>
     <w:p>
@@ -23,7 +119,19 @@
         <w:pStyle w:val="Author"/>
       </w:pPr>
       <w:r>
-        <w:t xml:space="preserve">Brian M Schilder</w:t>
+        <w:t xml:space="preserve">Brian</w:t>
+      </w:r>
+      <w:r>
+        <w:t xml:space="preserve"> </w:t>
+      </w:r>
+      <w:r>
+        <w:t xml:space="preserve">M</w:t>
+      </w:r>
+      <w:r>
+        <w:t xml:space="preserve"> </w:t>
+      </w:r>
+      <w:r>
+        <w:t xml:space="preserve">Schilder</w:t>
       </w:r>
     </w:p>
     <w:p>
@@ -31,7 +139,19 @@
         <w:pStyle w:val="Author"/>
       </w:pPr>
       <w:r>
-        <w:t xml:space="preserve">Nathan G Skene</w:t>
+        <w:t xml:space="preserve">Nathan</w:t>
+      </w:r>
+      <w:r>
+        <w:t xml:space="preserve"> </w:t>
+      </w:r>
+      <w:r>
+        <w:t xml:space="preserve">G</w:t>
+      </w:r>
+      <w:r>
+        <w:t xml:space="preserve"> </w:t>
+      </w:r>
+      <w:r>
+        <w:t xml:space="preserve">Skene</w:t>
       </w:r>
     </w:p>
     <w:p>
@@ -39,7 +159,7 @@
         <w:pStyle w:val="Date"/>
       </w:pPr>
       <w:r>
-        <w:t xml:space="preserve">2026-03-18</w:t>
+        <w:t xml:space="preserve">2026-04-09</w:t>
       </w:r>
     </w:p>
     <w:bookmarkStart w:id="20" w:name="abstract"/>
@@ -62,7 +182,13 @@
         <w:t xml:space="preserve"> </w:t>
       </w:r>
       <w:r>
-        <w:t xml:space="preserve">‘Cancer’</w:t>
+        <w:t xml:space="preserve">‘</w:t>
+      </w:r>
+      <w:r>
+        <w:t xml:space="preserve">Cancer</w:t>
+      </w:r>
+      <w:r>
+        <w:t xml:space="preserve">’</w:t>
       </w:r>
       <w:r>
         <w:t xml:space="preserve"> </w:t>
@@ -162,7 +288,13 @@
         <w:t xml:space="preserve"> </w:t>
       </w:r>
       <w:r>
-        <w:t xml:space="preserve">‘severity tiers’</w:t>
+        <w:t xml:space="preserve">‘</w:t>
+      </w:r>
+      <w:r>
+        <w:t xml:space="preserve">severity tiers</w:t>
+      </w:r>
+      <w:r>
+        <w:t xml:space="preserve">’</w:t>
       </w:r>
       <w:r>
         <w:t xml:space="preserve">. While characteristics such as shortened lifespan in infancy and intellectual disability were identified as highly severe and placed into tier 1, sensory impairment and reduced lifespan were categorised as less severe and placed into tier 4. Standardised metrics of severity allow clinicians to quickly assess the urgency of treating a given phenotype, as well as prognosing what outcomes might be expected. Here, we used the clinical characteristics introduced in</w:t>
@@ -227,8 +359,9 @@
       <w:tblPr>
         <w:tblStyle w:val="Table"/>
         <w:tblW w:type="pct" w:w="5000"/>
+        <w:tblLook w:firstRow="0" w:lastRow="0" w:firstColumn="0" w:lastColumn="0" w:noHBand="0" w:noVBand="0" w:val="0000"/>
+        <w:jc w:val="start"/>
         <w:tblLayout w:type="fixed"/>
-        <w:tblLook w:firstRow="0" w:lastRow="0" w:firstColumn="0" w:lastColumn="0" w:noHBand="0" w:noVBand="0" w:val="0000"/>
       </w:tblPr>
       <w:tblGrid>
         <w:gridCol w:w="7920"/>
@@ -290,7 +423,7 @@
               <w:jc w:val="center"/>
             </w:pPr>
             <w:pPr>
-              <w:jc w:val="left"/>
+              <w:jc w:val="start"/>
               <w:spacing w:before="200"/>
               <w:pStyle w:val="ImageCaption"/>
             </w:pPr>
@@ -302,8 +435,8 @@
             </w:r>
             <w:r>
               <w:rPr>
+                <w:bCs/>
                 <w:b/>
-                <w:bCs/>
               </w:rPr>
               <w:t xml:space="preserve">a</w:t>
             </w:r>
@@ -315,8 +448,8 @@
             </w:r>
             <w:r>
               <w:rPr>
+                <w:iCs/>
                 <w:i/>
-                <w:iCs/>
               </w:rPr>
               <w:t xml:space="preserve">italicised</w:t>
             </w:r>
@@ -328,8 +461,8 @@
             </w:r>
             <w:r>
               <w:rPr>
+                <w:bCs/>
                 <w:b/>
-                <w:bCs/>
               </w:rPr>
               <w:t xml:space="preserve">b</w:t>
             </w:r>
@@ -413,7 +546,13 @@
         <w:t xml:space="preserve"> </w:t>
       </w:r>
       <w:r>
-        <w:t xml:space="preserve">‘Stillbirth’</w:t>
+        <w:t xml:space="preserve">‘</w:t>
+      </w:r>
+      <w:r>
+        <w:t xml:space="preserve">Stillbirth</w:t>
+      </w:r>
+      <w:r>
+        <w:t xml:space="preserve">’</w:t>
       </w:r>
       <w:r>
         <w:t xml:space="preserve">,</w:t>
@@ -422,7 +561,13 @@
         <w:t xml:space="preserve"> </w:t>
       </w:r>
       <w:r>
-        <w:t xml:space="preserve">‘Anencephaly’</w:t>
+        <w:t xml:space="preserve">‘</w:t>
+      </w:r>
+      <w:r>
+        <w:t xml:space="preserve">Anencephaly</w:t>
+      </w:r>
+      <w:r>
+        <w:t xml:space="preserve">’</w:t>
       </w:r>
       <w:r>
         <w:t xml:space="preserve"> </w:t>
@@ -434,7 +579,13 @@
         <w:t xml:space="preserve"> </w:t>
       </w:r>
       <w:r>
-        <w:t xml:space="preserve">‘Bilateral lung agenesis’</w:t>
+        <w:t xml:space="preserve">‘</w:t>
+      </w:r>
+      <w:r>
+        <w:t xml:space="preserve">Bilateral lung agenesis</w:t>
+      </w:r>
+      <w:r>
+        <w:t xml:space="preserve">’</w:t>
       </w:r>
       <w:r>
         <w:t xml:space="preserve">.Meanwhile, 45% of phenotypes were annotated as never causing death (n=7880). Examples of phenotypes that never cause death included 34 unique forms of syndactyly, a non-lethal condition that causes fused or webbed fingers (occurring 1 in 1,200–15,000 live births). Although syndactyly can occur alongside life-threatening conditions such as Aspert Syndrome</w:t>
@@ -482,8 +633,8 @@
       </w:r>
       <w:r>
         <w:rPr>
+          <w:iCs/>
           <w:i/>
-          <w:iCs/>
         </w:rPr>
         <w:t xml:space="preserve">consistency rate</w:t>
       </w:r>
@@ -494,7 +645,13 @@
         <w:t xml:space="preserve"> </w:t>
       </w:r>
       <w:r>
-        <w:t xml:space="preserve">‘always’</w:t>
+        <w:t xml:space="preserve">‘</w:t>
+      </w:r>
+      <w:r>
+        <w:t xml:space="preserve">always</w:t>
+      </w:r>
+      <w:r>
+        <w:t xml:space="preserve">’</w:t>
       </w:r>
       <w:r>
         <w:t xml:space="preserve"> </w:t>
@@ -506,7 +663,13 @@
         <w:t xml:space="preserve"> </w:t>
       </w:r>
       <w:r>
-        <w:t xml:space="preserve">‘often’</w:t>
+        <w:t xml:space="preserve">‘</w:t>
+      </w:r>
+      <w:r>
+        <w:t xml:space="preserve">often</w:t>
+      </w:r>
+      <w:r>
+        <w:t xml:space="preserve">’</w:t>
       </w:r>
       <w:r>
         <w:t xml:space="preserve">, or</w:t>
@@ -515,7 +678,13 @@
         <w:t xml:space="preserve"> </w:t>
       </w:r>
       <w:r>
-        <w:t xml:space="preserve">‘never’</w:t>
+        <w:t xml:space="preserve">‘</w:t>
+      </w:r>
+      <w:r>
+        <w:t xml:space="preserve">never</w:t>
+      </w:r>
+      <w:r>
+        <w:t xml:space="preserve">’</w:t>
       </w:r>
       <w:r>
         <w:t xml:space="preserve"> </w:t>
@@ -527,13 +696,25 @@
         <w:t xml:space="preserve"> </w:t>
       </w:r>
       <w:r>
-        <w:t xml:space="preserve">‘rarely’</w:t>
+        <w:t xml:space="preserve">‘</w:t>
+      </w:r>
+      <w:r>
+        <w:t xml:space="preserve">rarely</w:t>
+      </w:r>
+      <w:r>
+        <w:t xml:space="preserve">’</w:t>
       </w:r>
       <w:r>
         <w:t xml:space="preserve">. The second, more stringent metric, required exact agreement in annotation occurrences, e.g. </w:t>
       </w:r>
       <w:r>
-        <w:t xml:space="preserve">‘always’</w:t>
+        <w:t xml:space="preserve">‘</w:t>
+      </w:r>
+      <w:r>
+        <w:t xml:space="preserve">always</w:t>
+      </w:r>
+      <w:r>
+        <w:t xml:space="preserve">’</w:t>
       </w:r>
       <w:r>
         <w:t xml:space="preserve"> </w:t>
@@ -545,7 +726,13 @@
         <w:t xml:space="preserve"> </w:t>
       </w:r>
       <w:r>
-        <w:t xml:space="preserve">‘always’</w:t>
+        <w:t xml:space="preserve">‘</w:t>
+      </w:r>
+      <w:r>
+        <w:t xml:space="preserve">always</w:t>
+      </w:r>
+      <w:r>
+        <w:t xml:space="preserve">’</w:t>
       </w:r>
       <w:r>
         <w:t xml:space="preserve">. For the less stringent metric, duplicated phenotypes were annotated consistently at a rate of at least 80%, and for the more stringent metric, the lowest consistency rate was 57% for congenital onset (</w:t>
@@ -565,7 +752,13 @@
         <w:t xml:space="preserve"> </w:t>
       </w:r>
       <w:r>
-        <w:t xml:space="preserve">‘Acute leukaemia’</w:t>
+        <w:t xml:space="preserve">‘</w:t>
+      </w:r>
+      <w:r>
+        <w:t xml:space="preserve">Acute leukaemia</w:t>
+      </w:r>
+      <w:r>
+        <w:t xml:space="preserve">’</w:t>
       </w:r>
       <w:r>
         <w:t xml:space="preserve">. One time, GPT-4 annotated it as often causing impaired mobility, giving the justification that</w:t>
@@ -574,7 +767,13 @@
         <w:t xml:space="preserve"> </w:t>
       </w:r>
       <w:r>
-        <w:t xml:space="preserve">‘weakness and fatigue from leukaemia and its treatment can impair mobility’</w:t>
+        <w:t xml:space="preserve">‘</w:t>
+      </w:r>
+      <w:r>
+        <w:t xml:space="preserve">weakness and fatigue from leukaemia and its treatment can impair mobility</w:t>
+      </w:r>
+      <w:r>
+        <w:t xml:space="preserve">’</w:t>
       </w:r>
       <w:r>
         <w:t xml:space="preserve">. The other time, GPT-4 annotated it as rarely causing impaired mobility, giving the justification that</w:t>
@@ -583,13 +782,25 @@
         <w:t xml:space="preserve"> </w:t>
       </w:r>
       <w:r>
-        <w:t xml:space="preserve">‘acute leukaemia rarely impairs mobility directly’</w:t>
+        <w:t xml:space="preserve">‘</w:t>
+      </w:r>
+      <w:r>
+        <w:t xml:space="preserve">acute leukaemia rarely impairs mobility directly</w:t>
+      </w:r>
+      <w:r>
+        <w:t xml:space="preserve">’</w:t>
       </w:r>
       <w:r>
         <w:t xml:space="preserve">. Despite specifying in the prompt for GPT-4 not to take into consideration indirect effects, this is an example of where it failed to do so. To investigate this further, clinical characteristic justifications were searched for terms indicating indirect causation (</w:t>
       </w:r>
       <w:r>
-        <w:t xml:space="preserve">‘indirectly’</w:t>
+        <w:t xml:space="preserve">‘</w:t>
+      </w:r>
+      <w:r>
+        <w:t xml:space="preserve">indirectly</w:t>
+      </w:r>
+      <w:r>
+        <w:t xml:space="preserve">’</w:t>
       </w:r>
       <w:r>
         <w:t xml:space="preserve">,</w:t>
@@ -598,7 +809,13 @@
         <w:t xml:space="preserve"> </w:t>
       </w:r>
       <w:r>
-        <w:t xml:space="preserve">‘does not directly’</w:t>
+        <w:t xml:space="preserve">‘</w:t>
+      </w:r>
+      <w:r>
+        <w:t xml:space="preserve">does not directly</w:t>
+      </w:r>
+      <w:r>
+        <w:t xml:space="preserve">’</w:t>
       </w:r>
       <w:r>
         <w:t xml:space="preserve">), identifying 4495 HPO terms. The majority (n=3516) were classified as</w:t>
@@ -607,7 +824,13 @@
         <w:t xml:space="preserve"> </w:t>
       </w:r>
       <w:r>
-        <w:t xml:space="preserve">‘never’</w:t>
+        <w:t xml:space="preserve">‘</w:t>
+      </w:r>
+      <w:r>
+        <w:t xml:space="preserve">never</w:t>
+      </w:r>
+      <w:r>
+        <w:t xml:space="preserve">’</w:t>
       </w:r>
       <w:r>
         <w:t xml:space="preserve"> </w:t>
@@ -619,7 +842,13 @@
         <w:t xml:space="preserve"> </w:t>
       </w:r>
       <w:r>
-        <w:t xml:space="preserve">“Obesity does not directly cause cancer, although it is a risk factor for various types of cancer. 1385 terms rarely caused the associated clinical characteristic. For example, “While this condition (Third degree atrioventricular block) does not directly cause intellectual disability, complications such as cardiac arrest and insufficient oxygen delivery to the brain can cause damage leading to cognitive impairments.”</w:t>
+        <w:t xml:space="preserve">“</w:t>
+      </w:r>
+      <w:r>
+        <w:t xml:space="preserve">Obesity does not directly cause cancer, although it is a risk factor for various types of cancer. 1385 terms rarely caused the associated clinical characteristic. For example, “While this condition (Third degree atrioventricular block) does not directly cause intellectual disability, complications such as cardiac arrest and insufficient oxygen delivery to the brain can cause damage leading to cognitive impairments.</w:t>
+      </w:r>
+      <w:r>
+        <w:t xml:space="preserve">”</w:t>
       </w:r>
       <w:r>
         <w:t xml:space="preserve"> </w:t>
@@ -631,7 +860,13 @@
         <w:t xml:space="preserve"> </w:t>
       </w:r>
       <w:r>
-        <w:t xml:space="preserve">‘often’</w:t>
+        <w:t xml:space="preserve">‘</w:t>
+      </w:r>
+      <w:r>
+        <w:t xml:space="preserve">often</w:t>
+      </w:r>
+      <w:r>
+        <w:t xml:space="preserve">’</w:t>
       </w:r>
       <w:r>
         <w:t xml:space="preserve"> </w:t>
@@ -643,7 +878,13 @@
         <w:t xml:space="preserve"> </w:t>
       </w:r>
       <w:r>
-        <w:t xml:space="preserve">“Increased C-peptide level is often associated with insulinoma, a rare pancreatic tumor, but does not directly cause it.”</w:t>
+        <w:t xml:space="preserve">“</w:t>
+      </w:r>
+      <w:r>
+        <w:t xml:space="preserve">Increased C-peptide level is often associated with insulinoma, a rare pancreatic tumor, but does not directly cause it.</w:t>
+      </w:r>
+      <w:r>
+        <w:t xml:space="preserve">”</w:t>
       </w:r>
       <w:r>
         <w:t xml:space="preserve"> </w:t>
@@ -655,7 +896,13 @@
         <w:t xml:space="preserve"> </w:t>
       </w:r>
       <w:r>
-        <w:t xml:space="preserve">‘always’</w:t>
+        <w:t xml:space="preserve">‘</w:t>
+      </w:r>
+      <w:r>
+        <w:t xml:space="preserve">always</w:t>
+      </w:r>
+      <w:r>
+        <w:t xml:space="preserve">’</w:t>
       </w:r>
       <w:r>
         <w:t xml:space="preserve"> </w:t>
@@ -667,7 +914,13 @@
         <w:t xml:space="preserve"> </w:t>
       </w:r>
       <w:r>
-        <w:t xml:space="preserve">‘never’</w:t>
+        <w:t xml:space="preserve">‘</w:t>
+      </w:r>
+      <w:r>
+        <w:t xml:space="preserve">never</w:t>
+      </w:r>
+      <w:r>
+        <w:t xml:space="preserve">’</w:t>
       </w:r>
       <w:r>
         <w:t xml:space="preserve"> </w:t>
@@ -692,7 +945,7 @@
         <w:pStyle w:val="BodyText"/>
       </w:pPr>
       <w:r>
-        <w:t xml:space="preserve">We also reasoned that GPT-4 would be better able to give consistent answers for more specific phenotypes lower in the ontology, as they are more likely to have a single cause (Spearman’s rank correlation rho, estimate = -0.246, p = &lt;2e-16),</w:t>
+        <w:t xml:space="preserve">We also reasoned that GPT-4 would be better able to give consistent answers for more specific phenotypes lower in the ontology, as they are more likely to have a single cause (Spearman’s rank correlation rho, estimate = -0.254, p = &lt;2e-16),</w:t>
       </w:r>
       <w:r>
         <w:t xml:space="preserve"> </w:t>
@@ -813,8 +1066,9 @@
       <w:tblPr>
         <w:tblStyle w:val="Table"/>
         <w:tblW w:type="pct" w:w="5000"/>
+        <w:tblLook w:firstRow="0" w:lastRow="0" w:firstColumn="0" w:lastColumn="0" w:noHBand="0" w:noVBand="0" w:val="0000"/>
+        <w:jc w:val="start"/>
         <w:tblLayout w:type="fixed"/>
-        <w:tblLook w:firstRow="0" w:lastRow="0" w:firstColumn="0" w:lastColumn="0" w:noHBand="0" w:noVBand="0" w:val="0000"/>
       </w:tblPr>
       <w:tblGrid>
         <w:gridCol w:w="7920"/>
@@ -876,7 +1130,7 @@
               <w:jc w:val="center"/>
             </w:pPr>
             <w:pPr>
-              <w:jc w:val="left"/>
+              <w:jc w:val="start"/>
               <w:spacing w:before="200"/>
               <w:pStyle w:val="ImageCaption"/>
             </w:pPr>
@@ -888,8 +1142,8 @@
             </w:r>
             <w:r>
               <w:rPr>
+                <w:bCs/>
                 <w:b/>
-                <w:bCs/>
               </w:rPr>
               <w:t xml:space="preserve">a</w:t>
             </w:r>
@@ -900,13 +1154,25 @@
               <w:t xml:space="preserve">Barplot showing the annotation consistency within phenotypes that were annotated more than once. In the lenient metric, annotations were collapsed into two groups (</w:t>
             </w:r>
             <w:r>
-              <w:t xml:space="preserve">‘always’</w:t>
+              <w:t xml:space="preserve">‘</w:t>
+            </w:r>
+            <w:r>
+              <w:t xml:space="preserve">always</w:t>
+            </w:r>
+            <w:r>
+              <w:t xml:space="preserve">’</w:t>
             </w:r>
             <w:r>
               <w:t xml:space="preserve">/</w:t>
             </w:r>
             <w:r>
-              <w:t xml:space="preserve">‘often’</w:t>
+              <w:t xml:space="preserve">‘</w:t>
+            </w:r>
+            <w:r>
+              <w:t xml:space="preserve">often</w:t>
+            </w:r>
+            <w:r>
+              <w:t xml:space="preserve">’</w:t>
             </w:r>
             <w:r>
               <w:t xml:space="preserve"> </w:t>
@@ -918,13 +1184,25 @@
               <w:t xml:space="preserve"> </w:t>
             </w:r>
             <w:r>
-              <w:t xml:space="preserve">‘never’</w:t>
+              <w:t xml:space="preserve">‘</w:t>
+            </w:r>
+            <w:r>
+              <w:t xml:space="preserve">never</w:t>
+            </w:r>
+            <w:r>
+              <w:t xml:space="preserve">’</w:t>
             </w:r>
             <w:r>
               <w:t xml:space="preserve">/</w:t>
             </w:r>
             <w:r>
-              <w:t xml:space="preserve">‘rarely’</w:t>
+              <w:t xml:space="preserve">‘</w:t>
+            </w:r>
+            <w:r>
+              <w:t xml:space="preserve">rarely</w:t>
+            </w:r>
+            <w:r>
+              <w:t xml:space="preserve">’</w:t>
             </w:r>
             <w:r>
               <w:t xml:space="preserve">). For a given clinical characteristic within a given phenotype, if an annotation was always within the same group it was considered consistent. In the stringent metric, all four annotation categories were considered to be different from one another. Thus, annotations were only defined as consistent if they were all identical. The blue dashed line indicates the probability of two annotations being consistent by chance in the lenient metric (~1/2). The gold dashed line is the probability of two annotations being consistent by chance in the stringent metric (~1/4).</w:t>
@@ -934,8 +1212,8 @@
             </w:r>
             <w:r>
               <w:rPr>
+                <w:bCs/>
                 <w:b/>
-                <w:bCs/>
               </w:rPr>
               <w:t xml:space="preserve">b</w:t>
             </w:r>
@@ -962,7 +1240,13 @@
         <w:t xml:space="preserve"> </w:t>
       </w:r>
       <w:r>
-        <w:t xml:space="preserve">‘Decreased fertility in females’</w:t>
+        <w:t xml:space="preserve">‘</w:t>
+      </w:r>
+      <w:r>
+        <w:t xml:space="preserve">Decreased fertility in females</w:t>
+      </w:r>
+      <w:r>
+        <w:t xml:space="preserve">’</w:t>
       </w:r>
       <w:r>
         <w:t xml:space="preserve"> </w:t>
@@ -974,7 +1258,13 @@
         <w:t xml:space="preserve"> </w:t>
       </w:r>
       <w:r>
-        <w:t xml:space="preserve">‘Decreased fertility in males’</w:t>
+        <w:t xml:space="preserve">‘</w:t>
+      </w:r>
+      <w:r>
+        <w:t xml:space="preserve">Decreased fertility in males</w:t>
+      </w:r>
+      <w:r>
+        <w:t xml:space="preserve">’</w:t>
       </w:r>
       <w:r>
         <w:t xml:space="preserve"> </w:t>
@@ -1005,7 +1295,13 @@
         <w:t xml:space="preserve"> </w:t>
       </w:r>
       <w:r>
-        <w:t xml:space="preserve">‘Angioma serpentinum’</w:t>
+        <w:t xml:space="preserve">‘</w:t>
+      </w:r>
+      <w:r>
+        <w:t xml:space="preserve">Angioma serpentinum</w:t>
+      </w:r>
+      <w:r>
+        <w:t xml:space="preserve">’</w:t>
       </w:r>
       <w:r>
         <w:t xml:space="preserve">,</w:t>
@@ -1014,7 +1310,13 @@
         <w:t xml:space="preserve"> </w:t>
       </w:r>
       <w:r>
-        <w:t xml:space="preserve">‘Nevus anemicus’</w:t>
+        <w:t xml:space="preserve">‘</w:t>
+      </w:r>
+      <w:r>
+        <w:t xml:space="preserve">Nevus anemicus</w:t>
+      </w:r>
+      <w:r>
+        <w:t xml:space="preserve">’</w:t>
       </w:r>
       <w:r>
         <w:t xml:space="preserve">,</w:t>
@@ -1023,7 +1325,13 @@
         <w:t xml:space="preserve"> </w:t>
       </w:r>
       <w:r>
-        <w:t xml:space="preserve">‘Pulmonary arteriovenous fistulas’</w:t>
+        <w:t xml:space="preserve">‘</w:t>
+      </w:r>
+      <w:r>
+        <w:t xml:space="preserve">Pulmonary arteriovenous fistulas</w:t>
+      </w:r>
+      <w:r>
+        <w:t xml:space="preserve">’</w:t>
       </w:r>
       <w:r>
         <w:t xml:space="preserve">. In the case of</w:t>
@@ -1032,7 +1340,13 @@
         <w:t xml:space="preserve"> </w:t>
       </w:r>
       <w:r>
-        <w:t xml:space="preserve">‘Angioma serpentinum’</w:t>
+        <w:t xml:space="preserve">‘</w:t>
+      </w:r>
+      <w:r>
+        <w:t xml:space="preserve">Angioma serpentinum</w:t>
+      </w:r>
+      <w:r>
+        <w:t xml:space="preserve">’</w:t>
       </w:r>
       <w:r>
         <w:t xml:space="preserve"> </w:t>
@@ -1044,7 +1358,13 @@
         <w:t xml:space="preserve"> </w:t>
       </w:r>
       <w:r>
-        <w:t xml:space="preserve">‘No known association with physical malformations’</w:t>
+        <w:t xml:space="preserve">‘</w:t>
+      </w:r>
+      <w:r>
+        <w:t xml:space="preserve">No known association with physical malformations</w:t>
+      </w:r>
+      <w:r>
+        <w:t xml:space="preserve">’</w:t>
       </w:r>
       <w:r>
         <w:t xml:space="preserve">. In another instance, GPT-4 noted that</w:t>
@@ -1053,7 +1373,13 @@
         <w:t xml:space="preserve"> </w:t>
       </w:r>
       <w:r>
-        <w:t xml:space="preserve">‘Nevus anemicus’</w:t>
+        <w:t xml:space="preserve">‘</w:t>
+      </w:r>
+      <w:r>
+        <w:t xml:space="preserve">Nevus anemicus</w:t>
+      </w:r>
+      <w:r>
+        <w:t xml:space="preserve">’</w:t>
       </w:r>
       <w:r>
         <w:t xml:space="preserve"> </w:t>
@@ -1065,7 +1391,13 @@
         <w:t xml:space="preserve"> </w:t>
       </w:r>
       <w:r>
-        <w:t xml:space="preserve">‘Limited to hypopigmented skin patch; no other malformations.’</w:t>
+        <w:t xml:space="preserve">‘</w:t>
+      </w:r>
+      <w:r>
+        <w:t xml:space="preserve">Limited to hypopigmented skin patch; no other malformations.</w:t>
+      </w:r>
+      <w:r>
+        <w:t xml:space="preserve">’</w:t>
       </w:r>
       <w:r>
         <w:t xml:space="preserve">. This indicates that while technically incorrect according to our predefined benchmarks, a case could in fact be made that mild skin conditions do not rise to the level of physical malformations.</w:t>
@@ -1082,7 +1414,13 @@
         <w:t xml:space="preserve"> </w:t>
       </w:r>
       <w:r>
-        <w:t xml:space="preserve">‘blindness’</w:t>
+        <w:t xml:space="preserve">‘</w:t>
+      </w:r>
+      <w:r>
+        <w:t xml:space="preserve">blindness</w:t>
+      </w:r>
+      <w:r>
+        <w:t xml:space="preserve">’</w:t>
       </w:r>
       <w:r>
         <w:t xml:space="preserve"> </w:t>
@@ -1094,25 +1432,37 @@
         <w:t xml:space="preserve"> </w:t>
       </w:r>
       <w:r>
-        <w:t xml:space="preserve">‘Severe intellectual disability’</w:t>
-      </w:r>
-      <w:r>
-        <w:t xml:space="preserve"> </w:t>
-      </w:r>
-      <w:r>
-        <w:t xml:space="preserve">as always causing intellectual disability is a relatively trivial task. Nevertheless, even these scenarios provide a clear and interpretable benchmark for the model’s performance. In addition, were numerous phenotypes with lexically non-obvious relationships to the clinical characteristic that were annotated correctly by GPT-4. For example,</w:t>
-      </w:r>
-      <w:r>
-        <w:t xml:space="preserve"> </w:t>
-      </w:r>
-      <w:r>
-        <w:t xml:space="preserve">‘Molar tooth sign on MRI’</w:t>
-      </w:r>
-      <w:r>
-        <w:t xml:space="preserve"> </w:t>
-      </w:r>
-      <w:r>
-        <w:t xml:space="preserve">(a neurodevelopmental pathology observed in radiological scans) was correctly annotated as causing intellectual disability.</w:t>
+        <w:t xml:space="preserve">‘</w:t>
+      </w:r>
+      <w:r>
+        <w:t xml:space="preserve">Severe intellectual disability</w:t>
+      </w:r>
+      <w:r>
+        <w:t xml:space="preserve">’</w:t>
+      </w:r>
+      <w:r>
+        <w:t xml:space="preserve"> </w:t>
+      </w:r>
+      <w:r>
+        <w:t xml:space="preserve">as always causing intellectual disability is a relatively trivial task. Nevertheless, even these scenarios provide a clear and interpretable benchmark for the model’s performance. In addition, there were numerous phenotypes with lexically non-obvious relationships to the clinical characteristic that were annotated correctly by GPT-4. For example,</w:t>
+      </w:r>
+      <w:r>
+        <w:t xml:space="preserve"> </w:t>
+      </w:r>
+      <w:r>
+        <w:t xml:space="preserve">‘</w:t>
+      </w:r>
+      <w:r>
+        <w:t xml:space="preserve">Molar tooth sign on MRI</w:t>
+      </w:r>
+      <w:r>
+        <w:t xml:space="preserve">’</w:t>
+      </w:r>
+      <w:r>
+        <w:t xml:space="preserve"> </w:t>
+      </w:r>
+      <w:r>
+        <w:t xml:space="preserve">(a neurodevelopmental pathology observed in radiological scans) was correctly annotated as causing intellectual disability. While our annotations were not validated by human experts, this study was designed as a computational framework, with the primary aim of demonstrating what can be achieved at scale. Nevertheless, we acknowledge that LLM-generated annotations may carry systematic biases or inaccuracies. Future work could explore the incorporation of expert validation to further assess these and other outputs.</w:t>
       </w:r>
     </w:p>
     <w:bookmarkEnd w:id="33"/>
@@ -1167,7 +1517,13 @@
         <w:t xml:space="preserve"> </w:t>
       </w:r>
       <w:r>
-        <w:t xml:space="preserve">‘Abnormal cellular phenotype’</w:t>
+        <w:t xml:space="preserve">‘</w:t>
+      </w:r>
+      <w:r>
+        <w:t xml:space="preserve">Abnormal cellular phenotype</w:t>
+      </w:r>
+      <w:r>
+        <w:t xml:space="preserve">’</w:t>
       </w:r>
       <w:r>
         <w:t xml:space="preserve"> </w:t>
@@ -1181,8 +1537,9 @@
       <w:tblPr>
         <w:tblStyle w:val="Table"/>
         <w:tblW w:type="pct" w:w="5000"/>
+        <w:tblLook w:firstRow="0" w:lastRow="0" w:firstColumn="0" w:lastColumn="0" w:noHBand="0" w:noVBand="0" w:val="0000"/>
+        <w:jc w:val="start"/>
         <w:tblLayout w:type="fixed"/>
-        <w:tblLook w:firstRow="0" w:lastRow="0" w:firstColumn="0" w:lastColumn="0" w:noHBand="0" w:noVBand="0" w:val="0000"/>
       </w:tblPr>
       <w:tblGrid>
         <w:gridCol w:w="7920"/>
@@ -1244,7 +1601,7 @@
               <w:jc w:val="center"/>
             </w:pPr>
             <w:pPr>
-              <w:jc w:val="left"/>
+              <w:jc w:val="start"/>
               <w:spacing w:before="200"/>
               <w:pStyle w:val="ImageCaption"/>
             </w:pPr>
@@ -1255,7 +1612,13 @@
               <w:t xml:space="preserve"> </w:t>
             </w:r>
             <w:r>
-              <w:t xml:space="preserve">‘Abnormal cellular phenotype’</w:t>
+              <w:t xml:space="preserve">‘</w:t>
+            </w:r>
+            <w:r>
+              <w:t xml:space="preserve">Abnormal cellular phenotype</w:t>
+            </w:r>
+            <w:r>
+              <w:t xml:space="preserve">’</w:t>
             </w:r>
             <w:r>
               <w:t xml:space="preserve"> </w:t>
@@ -1280,7 +1643,13 @@
         <w:t xml:space="preserve"> </w:t>
       </w:r>
       <w:r>
-        <w:t xml:space="preserve">‘Anencephaly’</w:t>
+        <w:t xml:space="preserve">‘</w:t>
+      </w:r>
+      <w:r>
+        <w:t xml:space="preserve">Anencephaly</w:t>
+      </w:r>
+      <w:r>
+        <w:t xml:space="preserve">’</w:t>
       </w:r>
       <w:r>
         <w:t xml:space="preserve"> </w:t>
@@ -1314,7 +1683,13 @@
         <w:t xml:space="preserve"> </w:t>
       </w:r>
       <w:r>
-        <w:t xml:space="preserve">‘Abnormal cellular phenotype’</w:t>
+        <w:t xml:space="preserve">‘</w:t>
+      </w:r>
+      <w:r>
+        <w:t xml:space="preserve">Abnormal cellular phenotype</w:t>
+      </w:r>
+      <w:r>
+        <w:t xml:space="preserve">’</w:t>
       </w:r>
       <w:r>
         <w:t xml:space="preserve"> </w:t>
@@ -1326,7 +1701,13 @@
         <w:t xml:space="preserve"> </w:t>
       </w:r>
       <w:r>
-        <w:t xml:space="preserve">‘Neoplasm’</w:t>
+        <w:t xml:space="preserve">‘</w:t>
+      </w:r>
+      <w:r>
+        <w:t xml:space="preserve">Neoplasm</w:t>
+      </w:r>
+      <w:r>
+        <w:t xml:space="preserve">’</w:t>
       </w:r>
       <w:r>
         <w:t xml:space="preserve"> </w:t>
@@ -1354,8 +1735,9 @@
       <w:tblPr>
         <w:tblStyle w:val="Table"/>
         <w:tblW w:type="pct" w:w="5000"/>
+        <w:tblLook w:firstRow="0" w:lastRow="0" w:firstColumn="0" w:lastColumn="0" w:noHBand="0" w:noVBand="0" w:val="0000"/>
+        <w:jc w:val="start"/>
         <w:tblLayout w:type="fixed"/>
-        <w:tblLook w:firstRow="0" w:lastRow="0" w:firstColumn="0" w:lastColumn="0" w:noHBand="0" w:noVBand="0" w:val="0000"/>
       </w:tblPr>
       <w:tblGrid>
         <w:gridCol w:w="7920"/>
@@ -1417,7 +1799,7 @@
               <w:jc w:val="center"/>
             </w:pPr>
             <w:pPr>
-              <w:jc w:val="left"/>
+              <w:jc w:val="start"/>
               <w:spacing w:before="200"/>
               <w:pStyle w:val="ImageCaption"/>
             </w:pPr>
@@ -1429,8 +1811,8 @@
             </w:r>
             <w:r>
               <w:rPr>
+                <w:bCs/>
                 <w:b/>
-                <w:bCs/>
               </w:rPr>
               <w:t xml:space="preserve">(a-b)</w:t>
             </w:r>
@@ -1445,8 +1827,8 @@
             </w:r>
             <w:r>
               <w:rPr>
+                <w:bCs/>
                 <w:b/>
-                <w:bCs/>
               </w:rPr>
               <w:t xml:space="preserve">(c-d)</w:t>
             </w:r>
@@ -1458,8 +1840,8 @@
             </w:r>
             <w:r>
               <w:rPr>
+                <w:bCs/>
                 <w:b/>
-                <w:bCs/>
               </w:rPr>
               <w:t xml:space="preserve">(b,d)</w:t>
             </w:r>
@@ -1608,7 +1990,13 @@
         <w:t xml:space="preserve"> </w:t>
       </w:r>
       <w:r>
-        <w:t xml:space="preserve">‘always’</w:t>
+        <w:t xml:space="preserve">‘</w:t>
+      </w:r>
+      <w:r>
+        <w:t xml:space="preserve">always</w:t>
+      </w:r>
+      <w:r>
+        <w:t xml:space="preserve">’</w:t>
       </w:r>
       <w:r>
         <w:t xml:space="preserve"> </w:t>
@@ -1632,8 +2020,9 @@
       <w:tblPr>
         <w:tblStyle w:val="Table"/>
         <w:tblW w:type="pct" w:w="5000"/>
+        <w:tblLook w:firstRow="0" w:lastRow="0" w:firstColumn="0" w:lastColumn="0" w:noHBand="0" w:noVBand="0" w:val="0000"/>
+        <w:jc w:val="start"/>
         <w:tblLayout w:type="fixed"/>
-        <w:tblLook w:firstRow="0" w:lastRow="0" w:firstColumn="0" w:lastColumn="0" w:noHBand="0" w:noVBand="0" w:val="0000"/>
       </w:tblPr>
       <w:tblGrid>
         <w:gridCol w:w="7920"/>
@@ -1695,7 +2084,7 @@
               <w:jc w:val="center"/>
             </w:pPr>
             <w:pPr>
-              <w:jc w:val="left"/>
+              <w:jc w:val="start"/>
               <w:spacing w:before="200"/>
               <w:pStyle w:val="ImageCaption"/>
             </w:pPr>
@@ -1734,7 +2123,19 @@
           <w:rPr>
             <w:rStyle w:val="Hyperlink"/>
           </w:rPr>
-          <w:t xml:space="preserve">‘Constitutional symptom’</w:t>
+          <w:t xml:space="preserve">‘</w:t>
+        </w:r>
+        <w:r>
+          <w:rPr>
+            <w:rStyle w:val="Hyperlink"/>
+          </w:rPr>
+          <w:t xml:space="preserve">Constitutional symptom</w:t>
+        </w:r>
+        <w:r>
+          <w:rPr>
+            <w:rStyle w:val="Hyperlink"/>
+          </w:rPr>
+          <w:t xml:space="preserve">’</w:t>
         </w:r>
       </w:hyperlink>
       <w:r>
@@ -1748,10 +2149,24 @@
       </w:r>
       <w:r>
         <w:rPr>
+          <w:iCs/>
           <w:i/>
+        </w:rPr>
+        <w:t xml:space="preserve">‘</w:t>
+      </w:r>
+      <w:r>
+        <w:rPr>
           <w:iCs/>
+          <w:i/>
         </w:rPr>
-        <w:t xml:space="preserve">‘A symptom or manifestation indicating a systemic or general effect of a disease and that may affect the general well-being or status of an individual.’</w:t>
+        <w:t xml:space="preserve">A symptom or manifestation indicating a systemic or general effect of a disease and that may affect the general well-being or status of an individual.</w:t>
+      </w:r>
+      <w:r>
+        <w:rPr>
+          <w:iCs/>
+          <w:i/>
+        </w:rPr>
+        <w:t xml:space="preserve">’</w:t>
       </w:r>
       <w:r>
         <w:t xml:space="preserve"> </w:t>
@@ -1763,13 +2178,25 @@
         <w:t xml:space="preserve"> </w:t>
       </w:r>
       <w:r>
-        <w:t xml:space="preserve">‘Fatigue’</w:t>
-      </w:r>
-      <w:r>
-        <w:t xml:space="preserve"> </w:t>
-      </w:r>
-      <w:r>
-        <w:t xml:space="preserve">‘Exercise intolerance’</w:t>
+        <w:t xml:space="preserve">‘</w:t>
+      </w:r>
+      <w:r>
+        <w:t xml:space="preserve">Fatigue</w:t>
+      </w:r>
+      <w:r>
+        <w:t xml:space="preserve">’</w:t>
+      </w:r>
+      <w:r>
+        <w:t xml:space="preserve"> </w:t>
+      </w:r>
+      <w:r>
+        <w:t xml:space="preserve">‘</w:t>
+      </w:r>
+      <w:r>
+        <w:t xml:space="preserve">Exercise intolerance</w:t>
+      </w:r>
+      <w:r>
+        <w:t xml:space="preserve">’</w:t>
       </w:r>
       <w:r>
         <w:t xml:space="preserve">,</w:t>
@@ -1778,7 +2205,13 @@
         <w:t xml:space="preserve"> </w:t>
       </w:r>
       <w:r>
-        <w:t xml:space="preserve">‘Hot flashes’</w:t>
+        <w:t xml:space="preserve">‘</w:t>
+      </w:r>
+      <w:r>
+        <w:t xml:space="preserve">Hot flashes</w:t>
+      </w:r>
+      <w:r>
+        <w:t xml:space="preserve">’</w:t>
       </w:r>
       <w:r>
         <w:t xml:space="preserve"> </w:t>
@@ -1790,7 +2223,13 @@
         <w:t xml:space="preserve"> </w:t>
       </w:r>
       <w:r>
-        <w:t xml:space="preserve">‘Sneeze’</w:t>
+        <w:t xml:space="preserve">‘</w:t>
+      </w:r>
+      <w:r>
+        <w:t xml:space="preserve">Sneeze</w:t>
+      </w:r>
+      <w:r>
+        <w:t xml:space="preserve">’</w:t>
       </w:r>
       <w:r>
         <w:t xml:space="preserve">.</w:t>
@@ -1881,7 +2320,13 @@
         <w:t xml:space="preserve"> </w:t>
       </w:r>
       <w:r>
-        <w:t xml:space="preserve">‘Molar tooth sign on MRI’</w:t>
+        <w:t xml:space="preserve">‘</w:t>
+      </w:r>
+      <w:r>
+        <w:t xml:space="preserve">Molar tooth sign on MRI</w:t>
+      </w:r>
+      <w:r>
+        <w:t xml:space="preserve">’</w:t>
       </w:r>
       <w:r>
         <w:t xml:space="preserve"> </w:t>
@@ -1937,7 +2382,13 @@
         <w:t xml:space="preserve"> </w:t>
       </w:r>
       <w:r>
-        <w:t xml:space="preserve">‘reasoning’</w:t>
+        <w:t xml:space="preserve">‘</w:t>
+      </w:r>
+      <w:r>
+        <w:t xml:space="preserve">reasoning</w:t>
+      </w:r>
+      <w:r>
+        <w:t xml:space="preserve">’</w:t>
       </w:r>
       <w:r>
         <w:t xml:space="preserve">), and deeper more complex models with low explainability but high interpretability</w:t>
@@ -1972,7 +2423,13 @@
         <w:t xml:space="preserve"> </w:t>
       </w:r>
       <w:r>
-        <w:t xml:space="preserve">‘Fetal akinesia sequence’</w:t>
+        <w:t xml:space="preserve">‘</w:t>
+      </w:r>
+      <w:r>
+        <w:t xml:space="preserve">Fetal akinesia sequence</w:t>
+      </w:r>
+      <w:r>
+        <w:t xml:space="preserve">’</w:t>
       </w:r>
       <w:r>
         <w:t xml:space="preserve"> </w:t>
@@ -1999,8 +2456,8 @@
       </w:r>
       <w:r>
         <w:rPr>
+          <w:iCs/>
           <w:i/>
-          <w:iCs/>
         </w:rPr>
         <w:t xml:space="preserve">in utero</w:t>
       </w:r>
@@ -2014,7 +2471,13 @@
         <w:t xml:space="preserve"> </w:t>
       </w:r>
       <w:r>
-        <w:t xml:space="preserve">‘always’</w:t>
+        <w:t xml:space="preserve">‘</w:t>
+      </w:r>
+      <w:r>
+        <w:t xml:space="preserve">always</w:t>
+      </w:r>
+      <w:r>
+        <w:t xml:space="preserve">’</w:t>
       </w:r>
       <w:r>
         <w:t xml:space="preserve">, when asked whether FAS causes sensory impairments it provided the response</w:t>
@@ -2023,7 +2486,13 @@
         <w:t xml:space="preserve"> </w:t>
       </w:r>
       <w:r>
-        <w:t xml:space="preserve">‘always’</w:t>
+        <w:t xml:space="preserve">‘</w:t>
+      </w:r>
+      <w:r>
+        <w:t xml:space="preserve">always</w:t>
+      </w:r>
+      <w:r>
+        <w:t xml:space="preserve">’</w:t>
       </w:r>
       <w:r>
         <w:t xml:space="preserve"> </w:t>
@@ -2035,7 +2504,13 @@
         <w:t xml:space="preserve"> </w:t>
       </w:r>
       <w:r>
-        <w:t xml:space="preserve">‘Fetal akinesia sequence typically results in severe sensory impairment due to neurodevelopmental disruption.’</w:t>
+        <w:t xml:space="preserve">‘</w:t>
+      </w:r>
+      <w:r>
+        <w:t xml:space="preserve">Fetal akinesia sequence typically results in severe sensory impairment due to neurodevelopmental disruption.</w:t>
+      </w:r>
+      <w:r>
+        <w:t xml:space="preserve">’</w:t>
       </w:r>
       <w:r>
         <w:t xml:space="preserve"> </w:t>
@@ -2078,7 +2553,16 @@
         <w:pStyle w:val="BodyText"/>
       </w:pPr>
       <w:r>
-        <w:t xml:space="preserve">One limitation of this study is that it did not test how GPT-4 considers treatment availability when making annotations. Some severe conditions, like syphilis or certain melanomas, are curable with early detection and modern healthcare. GPT-4 often linked outcomes to access and quality of care, describing some cancers as fatal unless caught early while noting others are rarely lethal if treatment is available. This suggests the model accounts for healthcare quality but not consistently. The study also did not capture differences in severity within the same phenotype, such as light sensitivity ranging from mild to disabling. Nor did it consider onset, disease course, or how phenotypes change in specific contexts, such as hypertension being mild in most people but severe in rare genetic disorders. These limitations extend beyond the annotations and to the construction of our severity score, which also doesn’t capture chronic burden versus lethality. These gaps highlight areas for future work.</w:t>
+        <w:t xml:space="preserve">One limitation of this study is that it did not test how GPT-4 considers treatment availability when making annotations. Some severe conditions, like syphilis or certain melanomas, are curable with early detection and modern healthcare. GPT-4 often linked outcomes to access and quality of care, describing some cancers as fatal unless caught early while noting others are rarely lethal if treatment is available. This suggests the model accounts for healthcare quality but not consistently. The study also did not capture differences in severity within the same phenotype, such as light sensitivity ranging from mild to disabling. Nor did it consider onset, disease course, or how phenotypes change in specific contexts, such as hypertension being mild in most people but severe in rare genetic disorders. Other features relevant to severity, such as pain intensity and frequency, frequency of hospitalisations, lifetime burden, psychological functioning, and social functioning, were also not considered. A relevant example where such features would likely have been important in highlighting severity is endometriosis, defined as the growth of endometrial tissue outside the uterus. It affects approximately 10% of women of reproductive age and is associated with cyclical and chronic pelvic pain, infertility, and significant impairment of psychological and social functioning</w:t>
+      </w:r>
+      <w:r>
+        <w:t xml:space="preserve"> </w:t>
+      </w:r>
+      <w:r>
+        <w:t xml:space="preserve">(Zondervan et al. 2018)</w:t>
+      </w:r>
+      <w:r>
+        <w:t xml:space="preserve">. It may also require repeated surgical intervention and hospitalisation. While our approach was able to capture severity associated with infertility, the associated pain burden, psychological and social impact, and potential need for surgery and hospitalisation were not reflected. These limitations extend beyond the annotations to the construction of the severity score itself, and highlight important areas for future work.</w:t>
       </w:r>
     </w:p>
     <w:p>
@@ -2190,8 +2674,9 @@
       <w:tblPr>
         <w:tblStyle w:val="Table"/>
         <w:tblW w:type="pct" w:w="5000"/>
+        <w:tblLook w:firstRow="0" w:lastRow="0" w:firstColumn="0" w:lastColumn="0" w:noHBand="0" w:noVBand="0" w:val="0000"/>
+        <w:jc w:val="start"/>
         <w:tblLayout w:type="fixed"/>
-        <w:tblLook w:firstRow="0" w:lastRow="0" w:firstColumn="0" w:lastColumn="0" w:noHBand="0" w:noVBand="0" w:val="0000"/>
       </w:tblPr>
       <w:tblGrid>
         <w:gridCol w:w="7920"/>
@@ -2205,7 +2690,7 @@
               <w:jc w:val="center"/>
             </w:pPr>
             <w:pPr>
-              <w:jc w:val="left"/>
+              <w:jc w:val="start"/>
               <w:spacing w:before="200"/>
               <w:pStyle w:val="ImageCaption"/>
             </w:pPr>
@@ -2217,8 +2702,9 @@
             <w:tblPr>
               <w:tblStyle w:val="Table"/>
               <w:tblW w:type="pct" w:w="5000"/>
+              <w:tblLook w:firstRow="1" w:lastRow="0" w:firstColumn="0" w:lastColumn="0" w:noHBand="0" w:noVBand="0" w:val="0020"/>
+              <w:jc w:val="start"/>
               <w:tblLayout w:type="fixed"/>
-              <w:tblLook w:firstRow="1" w:lastRow="0" w:firstColumn="0" w:lastColumn="0" w:noHBand="0" w:noVBand="0" w:val="0020"/>
             </w:tblPr>
             <w:tblGrid>
               <w:gridCol w:w="3168"/>
@@ -2227,7 +2713,7 @@
             </w:tblGrid>
             <w:tr>
               <w:trPr>
-                <w:tblHeader w:val="on"/>
+                <w:tblHeader w:val="true"/>
               </w:trPr>
               <w:tc>
                 <w:tcPr/>
@@ -2292,7 +2778,13 @@
                     <w:jc w:val="center"/>
                   </w:pPr>
                   <w:r>
-                    <w:t xml:space="preserve">‘Intellectual disability’</w:t>
+                    <w:t xml:space="preserve">‘</w:t>
+                  </w:r>
+                  <w:r>
+                    <w:t xml:space="preserve">Intellectual disability</w:t>
+                  </w:r>
+                  <w:r>
+                    <w:t xml:space="preserve">’</w:t>
                   </w:r>
                   <w:r>
                     <w:t xml:space="preserve">;</w:t>
@@ -2301,7 +2793,13 @@
                     <w:t xml:space="preserve"> </w:t>
                   </w:r>
                   <w:r>
-                    <w:t xml:space="preserve">‘Mental deterioration’</w:t>
+                    <w:t xml:space="preserve">‘</w:t>
+                  </w:r>
+                  <w:r>
+                    <w:t xml:space="preserve">Mental deterioration</w:t>
+                  </w:r>
+                  <w:r>
+                    <w:t xml:space="preserve">’</w:t>
                   </w:r>
                 </w:p>
               </w:tc>
@@ -2342,7 +2840,13 @@
                     <w:jc w:val="center"/>
                   </w:pPr>
                   <w:r>
-                    <w:t xml:space="preserve">‘Gait disturbance’</w:t>
+                    <w:t xml:space="preserve">‘</w:t>
+                  </w:r>
+                  <w:r>
+                    <w:t xml:space="preserve">Gait disturbance</w:t>
+                  </w:r>
+                  <w:r>
+                    <w:t xml:space="preserve">’</w:t>
                   </w:r>
                   <w:r>
                     <w:t xml:space="preserve">;</w:t>
@@ -2351,7 +2855,13 @@
                     <w:t xml:space="preserve"> </w:t>
                   </w:r>
                   <w:r>
-                    <w:t xml:space="preserve">‘Diminished movement’</w:t>
+                    <w:t xml:space="preserve">‘</w:t>
+                  </w:r>
+                  <w:r>
+                    <w:t xml:space="preserve">Diminished movement</w:t>
+                  </w:r>
+                  <w:r>
+                    <w:t xml:space="preserve">’</w:t>
                   </w:r>
                   <w:r>
                     <w:t xml:space="preserve">; ’ mobility’</w:t>
@@ -2395,7 +2905,13 @@
                     <w:jc w:val="center"/>
                   </w:pPr>
                   <w:r>
-                    <w:t xml:space="preserve">‘malformation’</w:t>
+                    <w:t xml:space="preserve">‘</w:t>
+                  </w:r>
+                  <w:r>
+                    <w:t xml:space="preserve">malformation</w:t>
+                  </w:r>
+                  <w:r>
+                    <w:t xml:space="preserve">’</w:t>
                   </w:r>
                 </w:p>
               </w:tc>
@@ -2436,7 +2952,13 @@
                     <w:jc w:val="center"/>
                   </w:pPr>
                   <w:r>
-                    <w:t xml:space="preserve">‘blindness’</w:t>
+                    <w:t xml:space="preserve">‘</w:t>
+                  </w:r>
+                  <w:r>
+                    <w:t xml:space="preserve">blindness</w:t>
+                  </w:r>
+                  <w:r>
+                    <w:t xml:space="preserve">’</w:t>
                   </w:r>
                 </w:p>
               </w:tc>
@@ -2477,7 +2999,13 @@
                     <w:jc w:val="center"/>
                   </w:pPr>
                   <w:r>
-                    <w:t xml:space="preserve">‘Abnormality of vision’</w:t>
+                    <w:t xml:space="preserve">‘</w:t>
+                  </w:r>
+                  <w:r>
+                    <w:t xml:space="preserve">Abnormality of vision</w:t>
+                  </w:r>
+                  <w:r>
+                    <w:t xml:space="preserve">’</w:t>
                   </w:r>
                   <w:r>
                     <w:t xml:space="preserve">;</w:t>
@@ -2486,7 +3014,13 @@
                     <w:t xml:space="preserve"> </w:t>
                   </w:r>
                   <w:r>
-                    <w:t xml:space="preserve">‘Abnormality of the sense of smell’</w:t>
+                    <w:t xml:space="preserve">‘</w:t>
+                  </w:r>
+                  <w:r>
+                    <w:t xml:space="preserve">Abnormality of the sense of smell</w:t>
+                  </w:r>
+                  <w:r>
+                    <w:t xml:space="preserve">’</w:t>
                   </w:r>
                   <w:r>
                     <w:t xml:space="preserve">;</w:t>
@@ -2495,7 +3029,13 @@
                     <w:t xml:space="preserve"> </w:t>
                   </w:r>
                   <w:r>
-                    <w:t xml:space="preserve">‘Abnormality of taste sensation’</w:t>
+                    <w:t xml:space="preserve">‘</w:t>
+                  </w:r>
+                  <w:r>
+                    <w:t xml:space="preserve">Abnormality of taste sensation</w:t>
+                  </w:r>
+                  <w:r>
+                    <w:t xml:space="preserve">’</w:t>
                   </w:r>
                   <w:r>
                     <w:t xml:space="preserve">;</w:t>
@@ -2504,7 +3044,13 @@
                     <w:t xml:space="preserve"> </w:t>
                   </w:r>
                   <w:r>
-                    <w:t xml:space="preserve">‘Somatic sensory dysfunction’</w:t>
+                    <w:t xml:space="preserve">‘</w:t>
+                  </w:r>
+                  <w:r>
+                    <w:t xml:space="preserve">Somatic sensory dysfunction</w:t>
+                  </w:r>
+                  <w:r>
+                    <w:t xml:space="preserve">’</w:t>
                   </w:r>
                   <w:r>
                     <w:t xml:space="preserve">;</w:t>
@@ -2513,7 +3059,13 @@
                     <w:t xml:space="preserve"> </w:t>
                   </w:r>
                   <w:r>
-                    <w:t xml:space="preserve">‘Hearing abnormality’</w:t>
+                    <w:t xml:space="preserve">‘</w:t>
+                  </w:r>
+                  <w:r>
+                    <w:t xml:space="preserve">Hearing abnormality</w:t>
+                  </w:r>
+                  <w:r>
+                    <w:t xml:space="preserve">’</w:t>
                   </w:r>
                 </w:p>
               </w:tc>
@@ -2554,7 +3106,13 @@
                     <w:jc w:val="center"/>
                   </w:pPr>
                   <w:r>
-                    <w:t xml:space="preserve">‘Immunodeficiency’</w:t>
+                    <w:t xml:space="preserve">‘</w:t>
+                  </w:r>
+                  <w:r>
+                    <w:t xml:space="preserve">Immunodeficiency</w:t>
+                  </w:r>
+                  <w:r>
+                    <w:t xml:space="preserve">’</w:t>
                   </w:r>
                   <w:r>
                     <w:t xml:space="preserve">;</w:t>
@@ -2563,7 +3121,13 @@
                     <w:t xml:space="preserve"> </w:t>
                   </w:r>
                   <w:r>
-                    <w:t xml:space="preserve">‘Impaired antigen-specific response’</w:t>
+                    <w:t xml:space="preserve">‘</w:t>
+                  </w:r>
+                  <w:r>
+                    <w:t xml:space="preserve">Impaired antigen-specific response</w:t>
+                  </w:r>
+                  <w:r>
+                    <w:t xml:space="preserve">’</w:t>
                   </w:r>
                 </w:p>
               </w:tc>
@@ -2604,7 +3168,13 @@
                     <w:jc w:val="center"/>
                   </w:pPr>
                   <w:r>
-                    <w:t xml:space="preserve">‘Cancer’</w:t>
+                    <w:t xml:space="preserve">‘</w:t>
+                  </w:r>
+                  <w:r>
+                    <w:t xml:space="preserve">Cancer</w:t>
+                  </w:r>
+                  <w:r>
+                    <w:t xml:space="preserve">’</w:t>
                   </w:r>
                   <w:r>
                     <w:t xml:space="preserve">;</w:t>
@@ -2613,7 +3183,13 @@
                     <w:t xml:space="preserve"> </w:t>
                   </w:r>
                   <w:r>
-                    <w:t xml:space="preserve">‘malignant’</w:t>
+                    <w:t xml:space="preserve">‘</w:t>
+                  </w:r>
+                  <w:r>
+                    <w:t xml:space="preserve">malignant</w:t>
+                  </w:r>
+                  <w:r>
+                    <w:t xml:space="preserve">’</w:t>
                   </w:r>
                   <w:r>
                     <w:t xml:space="preserve">;</w:t>
@@ -2622,7 +3198,13 @@
                     <w:t xml:space="preserve"> </w:t>
                   </w:r>
                   <w:r>
-                    <w:t xml:space="preserve">‘carcinoma’</w:t>
+                    <w:t xml:space="preserve">‘</w:t>
+                  </w:r>
+                  <w:r>
+                    <w:t xml:space="preserve">carcinoma</w:t>
+                  </w:r>
+                  <w:r>
+                    <w:t xml:space="preserve">’</w:t>
                   </w:r>
                 </w:p>
               </w:tc>
@@ -2663,7 +3245,13 @@
                     <w:jc w:val="center"/>
                   </w:pPr>
                   <w:r>
-                    <w:t xml:space="preserve">‘Decreased fertility’</w:t>
+                    <w:t xml:space="preserve">‘</w:t>
+                  </w:r>
+                  <w:r>
+                    <w:t xml:space="preserve">Decreased fertility</w:t>
+                  </w:r>
+                  <w:r>
+                    <w:t xml:space="preserve">’</w:t>
                   </w:r>
                   <w:r>
                     <w:t xml:space="preserve">;</w:t>
@@ -2672,7 +3260,13 @@
                     <w:t xml:space="preserve"> </w:t>
                   </w:r>
                   <w:r>
-                    <w:t xml:space="preserve">‘Hypogonadism’</w:t>
+                    <w:t xml:space="preserve">‘</w:t>
+                  </w:r>
+                  <w:r>
+                    <w:t xml:space="preserve">Hypogonadism</w:t>
+                  </w:r>
+                  <w:r>
+                    <w:t xml:space="preserve">’</w:t>
                   </w:r>
                 </w:p>
               </w:tc>
@@ -2707,7 +3301,13 @@
         <w:t xml:space="preserve"> </w:t>
       </w:r>
       <w:r>
-        <w:t xml:space="preserve">‘Intellectual disability’</w:t>
+        <w:t xml:space="preserve">‘</w:t>
+      </w:r>
+      <w:r>
+        <w:t xml:space="preserve">Intellectual disability</w:t>
+      </w:r>
+      <w:r>
+        <w:t xml:space="preserve">’</w:t>
       </w:r>
       <w:r>
         <w:t xml:space="preserve"> </w:t>
@@ -2719,7 +3319,13 @@
         <w:t xml:space="preserve"> </w:t>
       </w:r>
       <w:r>
-        <w:t xml:space="preserve">‘Mental deterioration’</w:t>
+        <w:t xml:space="preserve">‘</w:t>
+      </w:r>
+      <w:r>
+        <w:t xml:space="preserve">Mental deterioration</w:t>
+      </w:r>
+      <w:r>
+        <w:t xml:space="preserve">’</w:t>
       </w:r>
       <w:r>
         <w:t xml:space="preserve"> </w:t>
@@ -2760,7 +3366,13 @@
         <w:t xml:space="preserve"> </w:t>
       </w:r>
       <w:r>
-        <w:t xml:space="preserve">‘always’</w:t>
+        <w:t xml:space="preserve">‘</w:t>
+      </w:r>
+      <w:r>
+        <w:t xml:space="preserve">always</w:t>
+      </w:r>
+      <w:r>
+        <w:t xml:space="preserve">’</w:t>
       </w:r>
       <w:r>
         <w:t xml:space="preserve"> </w:t>
@@ -2772,7 +3384,13 @@
         <w:t xml:space="preserve"> </w:t>
       </w:r>
       <w:r>
-        <w:t xml:space="preserve">‘often’</w:t>
+        <w:t xml:space="preserve">‘</w:t>
+      </w:r>
+      <w:r>
+        <w:t xml:space="preserve">often</w:t>
+      </w:r>
+      <w:r>
+        <w:t xml:space="preserve">’</w:t>
       </w:r>
       <w:r>
         <w:t xml:space="preserve"> </w:t>
@@ -2784,7 +3402,13 @@
         <w:t xml:space="preserve"> </w:t>
       </w:r>
       <w:r>
-        <w:t xml:space="preserve">‘rarely’</w:t>
+        <w:t xml:space="preserve">‘</w:t>
+      </w:r>
+      <w:r>
+        <w:t xml:space="preserve">rarely</w:t>
+      </w:r>
+      <w:r>
+        <w:t xml:space="preserve">’</w:t>
       </w:r>
       <w:r>
         <w:t xml:space="preserve"> </w:t>
@@ -2796,7 +3420,13 @@
         <w:t xml:space="preserve"> </w:t>
       </w:r>
       <w:r>
-        <w:t xml:space="preserve">‘never’</w:t>
+        <w:t xml:space="preserve">‘</w:t>
+      </w:r>
+      <w:r>
+        <w:t xml:space="preserve">never</w:t>
+      </w:r>
+      <w:r>
+        <w:t xml:space="preserve">’</w:t>
       </w:r>
       <w:r>
         <w:t xml:space="preserve"> </w:t>
@@ -2819,7 +3449,13 @@
         <w:t xml:space="preserve"> </w:t>
       </w:r>
       <w:r>
-        <w:t xml:space="preserve">‘Tiers’</w:t>
+        <w:t xml:space="preserve">‘</w:t>
+      </w:r>
+      <w:r>
+        <w:t xml:space="preserve">Tiers</w:t>
+      </w:r>
+      <w:r>
+        <w:t xml:space="preserve">’</w:t>
       </w:r>
       <w:r>
         <w:t xml:space="preserve"> </w:t>
@@ -2901,7 +3537,13 @@
         <w:t xml:space="preserve"> </w:t>
       </w:r>
       <w:r>
-        <w:t xml:space="preserve">‘intellectual disability’</w:t>
+        <w:t xml:space="preserve">‘</w:t>
+      </w:r>
+      <w:r>
+        <w:t xml:space="preserve">intellectual disability</w:t>
+      </w:r>
+      <w:r>
+        <w:t xml:space="preserve">’</w:t>
       </w:r>
       <w:r>
         <w:t xml:space="preserve"> </w:t>
@@ -2913,7 +3555,13 @@
         <w:t xml:space="preserve"> </w:t>
       </w:r>
       <w:r>
-        <w:t xml:space="preserve">‘congenital onset’</w:t>
+        <w:t xml:space="preserve">‘</w:t>
+      </w:r>
+      <w:r>
+        <w:t xml:space="preserve">congenital onset</w:t>
+      </w:r>
+      <w:r>
+        <w:t xml:space="preserve">’</w:t>
       </w:r>
       <w:r>
         <w:t xml:space="preserve">).</w:t>
@@ -3154,8 +3802,9 @@
       <w:tblPr>
         <w:tblStyle w:val="Table"/>
         <w:tblW w:type="pct" w:w="5000"/>
+        <w:tblLook w:firstRow="0" w:lastRow="0" w:firstColumn="0" w:lastColumn="0" w:noHBand="0" w:noVBand="0" w:val="0000"/>
+        <w:jc w:val="start"/>
         <w:tblLayout w:type="fixed"/>
-        <w:tblLook w:firstRow="0" w:lastRow="0" w:firstColumn="0" w:lastColumn="0" w:noHBand="0" w:noVBand="0" w:val="0000"/>
       </w:tblPr>
       <w:tblGrid>
         <w:gridCol w:w="7920"/>
@@ -3169,7 +3818,7 @@
               <w:jc w:val="center"/>
             </w:pPr>
             <w:pPr>
-              <w:jc w:val="left"/>
+              <w:jc w:val="start"/>
               <w:spacing w:before="200"/>
               <w:pStyle w:val="ImageCaption"/>
             </w:pPr>
@@ -3181,8 +3830,9 @@
             <w:tblPr>
               <w:tblStyle w:val="Table"/>
               <w:tblW w:type="pct" w:w="5000"/>
+              <w:tblLook w:firstRow="1" w:lastRow="0" w:firstColumn="0" w:lastColumn="0" w:noHBand="0" w:noVBand="0" w:val="0020"/>
+              <w:jc w:val="start"/>
               <w:tblLayout w:type="fixed"/>
-              <w:tblLook w:firstRow="1" w:lastRow="0" w:firstColumn="0" w:lastColumn="0" w:noHBand="0" w:noVBand="0" w:val="0020"/>
             </w:tblPr>
             <w:tblGrid>
               <w:gridCol w:w="3168"/>
@@ -3193,7 +3843,7 @@
             </w:tblGrid>
             <w:tr>
               <w:trPr>
-                <w:tblHeader w:val="on"/>
+                <w:tblHeader w:val="true"/>
               </w:trPr>
               <w:tc>
                 <w:tcPr/>
@@ -3967,7 +4617,13 @@
         <w:t xml:space="preserve">was adapted here for use with the GPT-4 clinical characteristic annotations. This algorithm first assigned each clinical chacteristic to a tier, where Tier 1 indicated the most severe clinical characteristics and Tier 4 indicated the least severe clinical characteristics (</w:t>
       </w:r>
       <w:r>
-        <w:t xml:space="preserve">‘death’</w:t>
+        <w:t xml:space="preserve">‘</w:t>
+      </w:r>
+      <w:r>
+        <w:t xml:space="preserve">death</w:t>
+      </w:r>
+      <w:r>
+        <w:t xml:space="preserve">’</w:t>
       </w:r>
       <w:r>
         <w:t xml:space="preserve">=1,</w:t>
@@ -3976,7 +4632,13 @@
         <w:t xml:space="preserve"> </w:t>
       </w:r>
       <w:r>
-        <w:t xml:space="preserve">‘intellectual disability’</w:t>
+        <w:t xml:space="preserve">‘</w:t>
+      </w:r>
+      <w:r>
+        <w:t xml:space="preserve">intellectual disability</w:t>
+      </w:r>
+      <w:r>
+        <w:t xml:space="preserve">’</w:t>
       </w:r>
       <w:r>
         <w:t xml:space="preserve">=1,</w:t>
@@ -3985,7 +4647,13 @@
         <w:t xml:space="preserve"> </w:t>
       </w:r>
       <w:r>
-        <w:t xml:space="preserve">‘impaired mobility’</w:t>
+        <w:t xml:space="preserve">‘</w:t>
+      </w:r>
+      <w:r>
+        <w:t xml:space="preserve">impaired mobility</w:t>
+      </w:r>
+      <w:r>
+        <w:t xml:space="preserve">’</w:t>
       </w:r>
       <w:r>
         <w:t xml:space="preserve">=2,</w:t>
@@ -3994,7 +4662,13 @@
         <w:t xml:space="preserve"> </w:t>
       </w:r>
       <w:r>
-        <w:t xml:space="preserve">‘physical malformations’</w:t>
+        <w:t xml:space="preserve">‘</w:t>
+      </w:r>
+      <w:r>
+        <w:t xml:space="preserve">physical malformations</w:t>
+      </w:r>
+      <w:r>
+        <w:t xml:space="preserve">’</w:t>
       </w:r>
       <w:r>
         <w:t xml:space="preserve">=2,</w:t>
@@ -4003,7 +4677,13 @@
         <w:t xml:space="preserve"> </w:t>
       </w:r>
       <w:r>
-        <w:t xml:space="preserve">‘blindness’</w:t>
+        <w:t xml:space="preserve">‘</w:t>
+      </w:r>
+      <w:r>
+        <w:t xml:space="preserve">blindness</w:t>
+      </w:r>
+      <w:r>
+        <w:t xml:space="preserve">’</w:t>
       </w:r>
       <w:r>
         <w:t xml:space="preserve">=3,</w:t>
@@ -4012,7 +4692,13 @@
         <w:t xml:space="preserve"> </w:t>
       </w:r>
       <w:r>
-        <w:t xml:space="preserve">‘sensory impairments’</w:t>
+        <w:t xml:space="preserve">‘</w:t>
+      </w:r>
+      <w:r>
+        <w:t xml:space="preserve">sensory impairments</w:t>
+      </w:r>
+      <w:r>
+        <w:t xml:space="preserve">’</w:t>
       </w:r>
       <w:r>
         <w:t xml:space="preserve">=3,</w:t>
@@ -4021,7 +4707,13 @@
         <w:t xml:space="preserve"> </w:t>
       </w:r>
       <w:r>
-        <w:t xml:space="preserve">‘immunodeficiency’</w:t>
+        <w:t xml:space="preserve">‘</w:t>
+      </w:r>
+      <w:r>
+        <w:t xml:space="preserve">immunodeficiency</w:t>
+      </w:r>
+      <w:r>
+        <w:t xml:space="preserve">’</w:t>
       </w:r>
       <w:r>
         <w:t xml:space="preserve">=3,</w:t>
@@ -4030,7 +4722,13 @@
         <w:t xml:space="preserve"> </w:t>
       </w:r>
       <w:r>
-        <w:t xml:space="preserve">‘cancer’</w:t>
+        <w:t xml:space="preserve">‘</w:t>
+      </w:r>
+      <w:r>
+        <w:t xml:space="preserve">cancer</w:t>
+      </w:r>
+      <w:r>
+        <w:t xml:space="preserve">’</w:t>
       </w:r>
       <w:r>
         <w:t xml:space="preserve">=3,</w:t>
@@ -4039,7 +4737,13 @@
         <w:t xml:space="preserve"> </w:t>
       </w:r>
       <w:r>
-        <w:t xml:space="preserve">‘reduced fertility’</w:t>
+        <w:t xml:space="preserve">‘</w:t>
+      </w:r>
+      <w:r>
+        <w:t xml:space="preserve">reduced fertility</w:t>
+      </w:r>
+      <w:r>
+        <w:t xml:space="preserve">’</w:t>
       </w:r>
       <w:r>
         <w:t xml:space="preserve">=4). If a phenotype often or always caused more than one Tier 1 clinical characteristic, it was assigned a severity class of</w:t>
@@ -4048,7 +4752,13 @@
         <w:t xml:space="preserve"> </w:t>
       </w:r>
       <w:r>
-        <w:t xml:space="preserve">“Profound”</w:t>
+        <w:t xml:space="preserve">“</w:t>
+      </w:r>
+      <w:r>
+        <w:t xml:space="preserve">Profound</w:t>
+      </w:r>
+      <w:r>
+        <w:t xml:space="preserve">”</w:t>
       </w:r>
       <w:r>
         <w:t xml:space="preserve">. If the phenotype often or always caused only one Tier 1 clinical characteristic, it was assigned a severity class of</w:t>
@@ -4057,7 +4767,13 @@
         <w:t xml:space="preserve"> </w:t>
       </w:r>
       <w:r>
-        <w:t xml:space="preserve">“Severe”</w:t>
+        <w:t xml:space="preserve">“</w:t>
+      </w:r>
+      <w:r>
+        <w:t xml:space="preserve">Severe</w:t>
+      </w:r>
+      <w:r>
+        <w:t xml:space="preserve">”</w:t>
       </w:r>
       <w:r>
         <w:t xml:space="preserve">. A</w:t>
@@ -4066,7 +4782,13 @@
         <w:t xml:space="preserve"> </w:t>
       </w:r>
       <w:r>
-        <w:t xml:space="preserve">“Severe”</w:t>
+        <w:t xml:space="preserve">“</w:t>
+      </w:r>
+      <w:r>
+        <w:t xml:space="preserve">Severe</w:t>
+      </w:r>
+      <w:r>
+        <w:t xml:space="preserve">”</w:t>
       </w:r>
       <w:r>
         <w:t xml:space="preserve"> </w:t>
@@ -4078,7 +4800,13 @@
         <w:t xml:space="preserve"> </w:t>
       </w:r>
       <w:r>
-        <w:t xml:space="preserve">“Moderate”</w:t>
+        <w:t xml:space="preserve">“</w:t>
+      </w:r>
+      <w:r>
+        <w:t xml:space="preserve">Moderate</w:t>
+      </w:r>
+      <w:r>
+        <w:t xml:space="preserve">”</w:t>
       </w:r>
       <w:r>
         <w:t xml:space="preserve">. All remaining phenotypes were was assigned a severity class of</w:t>
@@ -4087,7 +4815,13 @@
         <w:t xml:space="preserve"> </w:t>
       </w:r>
       <w:r>
-        <w:t xml:space="preserve">“Mild”</w:t>
+        <w:t xml:space="preserve">“</w:t>
+      </w:r>
+      <w:r>
+        <w:t xml:space="preserve">Mild</w:t>
+      </w:r>
+      <w:r>
+        <w:t xml:space="preserve">”</w:t>
       </w:r>
       <w:r>
         <w:t xml:space="preserve">. In cases where the phenotype mapped to more than one class, only the most severe class was used. This procedure is implemented within the function</w:t>
@@ -4260,7 +4994,7 @@
     </w:p>
     <w:bookmarkEnd w:id="68"/>
     <w:bookmarkEnd w:id="69"/>
-    <w:bookmarkStart w:id="134" w:name="references"/>
+    <w:bookmarkStart w:id="136" w:name="references"/>
     <w:p>
       <w:pPr>
         <w:pStyle w:val="Heading2"/>
@@ -4269,7 +5003,7 @@
         <w:t xml:space="preserve">References</w:t>
       </w:r>
     </w:p>
-    <w:bookmarkStart w:id="133" w:name="refs"/>
+    <w:bookmarkStart w:id="135" w:name="refs"/>
     <w:bookmarkStart w:id="71" w:name="ref-boltonBioMedLM7BParameter2024"/>
     <w:p>
       <w:pPr>
@@ -4289,8 +5023,8 @@
       </w:r>
       <w:r>
         <w:rPr>
+          <w:iCs/>
           <w:i/>
-          <w:iCs/>
         </w:rPr>
         <w:t xml:space="preserve">arXiv</w:t>
       </w:r>
@@ -4332,8 +5066,8 @@
       </w:r>
       <w:r>
         <w:rPr>
+          <w:iCs/>
           <w:i/>
-          <w:iCs/>
         </w:rPr>
         <w:t xml:space="preserve">arXiv</w:t>
       </w:r>
@@ -4375,8 +5109,8 @@
       </w:r>
       <w:r>
         <w:rPr>
+          <w:iCs/>
           <w:i/>
-          <w:iCs/>
         </w:rPr>
         <w:t xml:space="preserve">Taiwanese Journal of Obstetrics and Gynecology</w:t>
       </w:r>
@@ -4421,8 +5155,8 @@
       </w:r>
       <w:r>
         <w:rPr>
+          <w:iCs/>
           <w:i/>
-          <w:iCs/>
         </w:rPr>
         <w:t xml:space="preserve">Annals of Biomedical Engineering</w:t>
       </w:r>
@@ -4473,8 +5207,8 @@
       </w:r>
       <w:r>
         <w:rPr>
+          <w:iCs/>
           <w:i/>
-          <w:iCs/>
         </w:rPr>
         <w:t xml:space="preserve">The Pediatric Upper Extremity</w:t>
       </w:r>
@@ -4516,8 +5250,8 @@
       </w:r>
       <w:r>
         <w:rPr>
+          <w:iCs/>
           <w:i/>
-          <w:iCs/>
         </w:rPr>
         <w:t xml:space="preserve">Nucleic Acids Research</w:t>
       </w:r>
@@ -4562,8 +5296,8 @@
       </w:r>
       <w:r>
         <w:rPr>
+          <w:iCs/>
           <w:i/>
-          <w:iCs/>
         </w:rPr>
         <w:t xml:space="preserve">American Journal of Medical Genetics Part A</w:t>
       </w:r>
@@ -4608,8 +5342,8 @@
       </w:r>
       <w:r>
         <w:rPr>
+          <w:iCs/>
           <w:i/>
-          <w:iCs/>
         </w:rPr>
         <w:t xml:space="preserve">ACM Transactions on Computing for Healthcare</w:t>
       </w:r>
@@ -4654,8 +5388,8 @@
       </w:r>
       <w:r>
         <w:rPr>
+          <w:iCs/>
           <w:i/>
-          <w:iCs/>
         </w:rPr>
         <w:t xml:space="preserve">arXiv</w:t>
       </w:r>
@@ -4697,8 +5431,8 @@
       </w:r>
       <w:r>
         <w:rPr>
+          <w:iCs/>
           <w:i/>
-          <w:iCs/>
         </w:rPr>
         <w:t xml:space="preserve">Journal of Documentation</w:t>
       </w:r>
@@ -4743,8 +5477,8 @@
       </w:r>
       <w:r>
         <w:rPr>
+          <w:iCs/>
           <w:i/>
-          <w:iCs/>
         </w:rPr>
         <w:t xml:space="preserve">Nucleic Acids Research</w:t>
       </w:r>
@@ -4789,8 +5523,8 @@
       </w:r>
       <w:r>
         <w:rPr>
+          <w:iCs/>
           <w:i/>
-          <w:iCs/>
         </w:rPr>
         <w:t xml:space="preserve">arXiv</w:t>
       </w:r>
@@ -4832,8 +5566,8 @@
       </w:r>
       <w:r>
         <w:rPr>
+          <w:iCs/>
           <w:i/>
-          <w:iCs/>
         </w:rPr>
         <w:t xml:space="preserve">PLoS One</w:t>
       </w:r>
@@ -4864,8 +5598,8 @@
       </w:r>
       <w:r>
         <w:rPr>
+          <w:iCs/>
           <w:i/>
-          <w:iCs/>
         </w:rPr>
         <w:t xml:space="preserve">Briefings in Bioinformatics</w:t>
       </w:r>
@@ -4910,8 +5644,8 @@
       </w:r>
       <w:r>
         <w:rPr>
+          <w:iCs/>
           <w:i/>
-          <w:iCs/>
         </w:rPr>
         <w:t xml:space="preserve">arXiv</w:t>
       </w:r>
@@ -4953,8 +5687,8 @@
       </w:r>
       <w:r>
         <w:rPr>
+          <w:iCs/>
           <w:i/>
-          <w:iCs/>
         </w:rPr>
         <w:t xml:space="preserve">arXiv</w:t>
       </w:r>
@@ -4996,8 +5730,8 @@
       </w:r>
       <w:r>
         <w:rPr>
+          <w:iCs/>
           <w:i/>
-          <w:iCs/>
         </w:rPr>
         <w:t xml:space="preserve">arXiv</w:t>
       </w:r>
@@ -5039,8 +5773,8 @@
       </w:r>
       <w:r>
         <w:rPr>
+          <w:iCs/>
           <w:i/>
-          <w:iCs/>
         </w:rPr>
         <w:t xml:space="preserve">Nucleic Acids Research</w:t>
       </w:r>
@@ -5085,8 +5819,8 @@
       </w:r>
       <w:r>
         <w:rPr>
+          <w:iCs/>
           <w:i/>
-          <w:iCs/>
         </w:rPr>
         <w:t xml:space="preserve">medRxiv</w:t>
       </w:r>
@@ -5128,8 +5862,8 @@
       </w:r>
       <w:r>
         <w:rPr>
+          <w:iCs/>
           <w:i/>
-          <w:iCs/>
         </w:rPr>
         <w:t xml:space="preserve">arXiv</w:t>
       </w:r>
@@ -5171,8 +5905,8 @@
       </w:r>
       <w:r>
         <w:rPr>
+          <w:iCs/>
           <w:i/>
-          <w:iCs/>
         </w:rPr>
         <w:t xml:space="preserve">bioRxiv</w:t>
       </w:r>
@@ -5214,8 +5948,8 @@
       </w:r>
       <w:r>
         <w:rPr>
+          <w:iCs/>
           <w:i/>
-          <w:iCs/>
         </w:rPr>
         <w:t xml:space="preserve">Nucleic Acids Research</w:t>
       </w:r>
@@ -5260,8 +5994,8 @@
       </w:r>
       <w:r>
         <w:rPr>
+          <w:iCs/>
           <w:i/>
-          <w:iCs/>
         </w:rPr>
         <w:t xml:space="preserve">arXiv</w:t>
       </w:r>
@@ -5303,8 +6037,8 @@
       </w:r>
       <w:r>
         <w:rPr>
+          <w:iCs/>
           <w:i/>
-          <w:iCs/>
         </w:rPr>
         <w:t xml:space="preserve">arXiv</w:t>
       </w:r>
@@ -5346,8 +6080,8 @@
       </w:r>
       <w:r>
         <w:rPr>
+          <w:iCs/>
           <w:i/>
-          <w:iCs/>
         </w:rPr>
         <w:t xml:space="preserve">Nucleic Acids Research</w:t>
       </w:r>
@@ -5398,8 +6132,8 @@
       </w:r>
       <w:r>
         <w:rPr>
+          <w:iCs/>
           <w:i/>
-          <w:iCs/>
         </w:rPr>
         <w:t xml:space="preserve">Proceedings of the 2020 Conference on Empirical Methods in Natural Language Processing (EMNLP)</w:t>
       </w:r>
@@ -5441,8 +6175,8 @@
       </w:r>
       <w:r>
         <w:rPr>
+          <w:iCs/>
           <w:i/>
-          <w:iCs/>
         </w:rPr>
         <w:t xml:space="preserve">Nature</w:t>
       </w:r>
@@ -5484,8 +6218,8 @@
       </w:r>
       <w:r>
         <w:rPr>
+          <w:iCs/>
           <w:i/>
-          <w:iCs/>
         </w:rPr>
         <w:t xml:space="preserve">arXiv</w:t>
       </w:r>
@@ -5527,8 +6261,8 @@
       </w:r>
       <w:r>
         <w:rPr>
+          <w:iCs/>
           <w:i/>
-          <w:iCs/>
         </w:rPr>
         <w:t xml:space="preserve">arXiv</w:t>
       </w:r>
@@ -5570,8 +6304,8 @@
       </w:r>
       <w:r>
         <w:rPr>
+          <w:iCs/>
           <w:i/>
-          <w:iCs/>
         </w:rPr>
         <w:t xml:space="preserve">Nature Medicine</w:t>
       </w:r>
@@ -5613,8 +6347,8 @@
       </w:r>
       <w:r>
         <w:rPr>
+          <w:iCs/>
           <w:i/>
-          <w:iCs/>
         </w:rPr>
         <w:t xml:space="preserve">arXiv</w:t>
       </w:r>
@@ -5656,8 +6390,8 @@
       </w:r>
       <w:r>
         <w:rPr>
+          <w:iCs/>
           <w:i/>
-          <w:iCs/>
         </w:rPr>
         <w:t xml:space="preserve">arXiv</w:t>
       </w:r>
@@ -5680,14 +6414,60 @@
       </w:r>
     </w:p>
     <w:bookmarkEnd w:id="132"/>
-    <w:bookmarkEnd w:id="133"/>
+    <w:bookmarkStart w:id="134" w:name="ref-Zondervan2018-endometriosis"/>
+    <w:p>
+      <w:pPr>
+        <w:pStyle w:val="Bibliography"/>
+      </w:pPr>
+      <w:r>
+        <w:t xml:space="preserve">Zondervan, Krina T, Christian M Becker, Kaori Koga, Stacey A Missmer, Robert N Taylor, and Paola Viganò. 2018.</w:t>
+      </w:r>
+      <w:r>
+        <w:t xml:space="preserve"> </w:t>
+      </w:r>
+      <w:r>
+        <w:t xml:space="preserve">“Endometriosis.”</w:t>
+      </w:r>
+      <w:r>
+        <w:t xml:space="preserve"> </w:t>
+      </w:r>
+      <w:r>
+        <w:rPr>
+          <w:iCs/>
+          <w:i/>
+        </w:rPr>
+        <w:t xml:space="preserve">Nat. Rev. Dis. Primers</w:t>
+      </w:r>
+      <w:r>
+        <w:t xml:space="preserve"> </w:t>
+      </w:r>
+      <w:r>
+        <w:t xml:space="preserve">4 (1): 9.</w:t>
+      </w:r>
+      <w:r>
+        <w:t xml:space="preserve"> </w:t>
+      </w:r>
+      <w:hyperlink r:id="rId133">
+        <w:r>
+          <w:rPr>
+            <w:rStyle w:val="Hyperlink"/>
+          </w:rPr>
+          <w:t xml:space="preserve">https://doi.org/10.1038/s41572-018-0008-5</w:t>
+        </w:r>
+      </w:hyperlink>
+      <w:r>
+        <w:t xml:space="preserve">.</w:t>
+      </w:r>
+    </w:p>
+    <w:bookmarkEnd w:id="134"/>
+    <w:bookmarkEnd w:id="135"/>
     <w:p>
       <w:r>
         <w:br w:type="page"/>
       </w:r>
     </w:p>
-    <w:bookmarkEnd w:id="134"/>
-    <w:bookmarkStart w:id="175" w:name="supplementary-materials"/>
+    <w:bookmarkEnd w:id="136"/>
+    <w:bookmarkStart w:id="177" w:name="supplementary-materials"/>
     <w:p>
       <w:pPr>
         <w:pStyle w:val="Heading2"/>
@@ -5696,7 +6476,7 @@
         <w:t xml:space="preserve">Supplementary Materials</w:t>
       </w:r>
     </w:p>
-    <w:bookmarkStart w:id="170" w:name="supplementary-figures"/>
+    <w:bookmarkStart w:id="172" w:name="supplementary-figures"/>
     <w:p>
       <w:pPr>
         <w:pStyle w:val="Heading3"/>
@@ -5705,13 +6485,14 @@
         <w:t xml:space="preserve">Supplementary Figures</w:t>
       </w:r>
     </w:p>
-    <w:bookmarkStart w:id="139" w:name="cell-fig-indirect-effects"/>
+    <w:bookmarkStart w:id="141" w:name="cell-fig-indirect-effects"/>
     <w:tbl>
       <w:tblPr>
         <w:tblStyle w:val="Table"/>
         <w:tblW w:type="pct" w:w="5000"/>
+        <w:tblLook w:firstRow="0" w:lastRow="0" w:firstColumn="0" w:lastColumn="0" w:noHBand="0" w:noVBand="0" w:val="0000"/>
+        <w:jc w:val="start"/>
         <w:tblLayout w:type="fixed"/>
-        <w:tblLook w:firstRow="0" w:lastRow="0" w:firstColumn="0" w:lastColumn="0" w:noHBand="0" w:noVBand="0" w:val="0000"/>
       </w:tblPr>
       <w:tblGrid>
         <w:gridCol w:w="7920"/>
@@ -5719,7 +6500,7 @@
       <w:tr>
         <w:tc>
           <w:tcPr/>
-          <w:bookmarkStart w:id="138" w:name="fig-indirect-effects"/>
+          <w:bookmarkStart w:id="140" w:name="fig-indirect-effects"/>
           <w:p>
             <w:pPr>
               <w:pStyle w:val="Compact"/>
@@ -5730,18 +6511,18 @@
                 <wp:inline>
                   <wp:extent cx="5334000" cy="2222500"/>
                   <wp:effectExtent b="0" l="0" r="0" t="0"/>
-                  <wp:docPr descr="" title="" id="136" name="Picture"/>
+                  <wp:docPr descr="" title="" id="138" name="Picture"/>
                   <a:graphic>
                     <a:graphicData uri="http://schemas.openxmlformats.org/drawingml/2006/picture">
                       <pic:pic>
                         <pic:nvPicPr>
-                          <pic:cNvPr descr="manuscript_files/figure-docx/fig-indirect-effects-1.png" id="137" name="Picture"/>
+                          <pic:cNvPr descr="manuscript_files/figure-docx/fig-indirect-effects-1.png" id="139" name="Picture"/>
                           <pic:cNvPicPr>
                             <a:picLocks noChangeArrowheads="1" noChangeAspect="1"/>
                           </pic:cNvPicPr>
                         </pic:nvPicPr>
                         <pic:blipFill>
-                          <a:blip r:embed="rId135"/>
+                          <a:blip r:embed="rId137"/>
                           <a:stretch>
                             <a:fillRect/>
                           </a:stretch>
@@ -5773,7 +6554,7 @@
               <w:jc w:val="center"/>
             </w:pPr>
             <w:pPr>
-              <w:jc w:val="left"/>
+              <w:jc w:val="start"/>
               <w:spacing w:before="200"/>
               <w:pStyle w:val="ImageCaption"/>
             </w:pPr>
@@ -5785,8 +6566,8 @@
             </w:r>
             <w:r>
               <w:rPr>
+                <w:bCs/>
                 <w:b/>
-                <w:bCs/>
               </w:rPr>
               <w:t xml:space="preserve">a</w:t>
             </w:r>
@@ -5797,7 +6578,13 @@
               <w:t xml:space="preserve">Clinical characteristic justifications were searched for terms indicating indirect causation (</w:t>
             </w:r>
             <w:r>
-              <w:t xml:space="preserve">‘indirectly’</w:t>
+              <w:t xml:space="preserve">‘</w:t>
+            </w:r>
+            <w:r>
+              <w:t xml:space="preserve">indirectly</w:t>
+            </w:r>
+            <w:r>
+              <w:t xml:space="preserve">’</w:t>
             </w:r>
             <w:r>
               <w:t xml:space="preserve">,</w:t>
@@ -5806,7 +6593,13 @@
               <w:t xml:space="preserve"> </w:t>
             </w:r>
             <w:r>
-              <w:t xml:space="preserve">‘does not directly’</w:t>
+              <w:t xml:space="preserve">‘</w:t>
+            </w:r>
+            <w:r>
+              <w:t xml:space="preserve">does not directly</w:t>
+            </w:r>
+            <w:r>
+              <w:t xml:space="preserve">’</w:t>
             </w:r>
             <w:r>
               <w:t xml:space="preserve">). To assess the impact of this indirect causation on severity scoring, all indirect causal terms were reassigned to</w:t>
@@ -5815,7 +6608,13 @@
               <w:t xml:space="preserve"> </w:t>
             </w:r>
             <w:r>
-              <w:t xml:space="preserve">‘never’</w:t>
+              <w:t xml:space="preserve">‘</w:t>
+            </w:r>
+            <w:r>
+              <w:t xml:space="preserve">never</w:t>
+            </w:r>
+            <w:r>
+              <w:t xml:space="preserve">’</w:t>
             </w:r>
             <w:r>
               <w:t xml:space="preserve"> </w:t>
@@ -5828,8 +6627,8 @@
             </w:r>
             <w:r>
               <w:rPr>
+                <w:bCs/>
                 <w:b/>
-                <w:bCs/>
               </w:rPr>
               <w:t xml:space="preserve">b</w:t>
             </w:r>
@@ -5840,18 +6639,19 @@
               <w:t xml:space="preserve">Phenotype classifications into severity classes remained unchanged between the original and recalculated severity scores.</w:t>
             </w:r>
           </w:p>
-          <w:bookmarkEnd w:id="138"/>
+          <w:bookmarkEnd w:id="140"/>
         </w:tc>
       </w:tr>
     </w:tbl>
-    <w:bookmarkEnd w:id="139"/>
-    <w:bookmarkStart w:id="144" w:name="cell-fig-genecounts-ontLvl"/>
+    <w:bookmarkEnd w:id="141"/>
+    <w:bookmarkStart w:id="146" w:name="cell-fig-genecounts-ontLvl"/>
     <w:tbl>
       <w:tblPr>
         <w:tblStyle w:val="Table"/>
         <w:tblW w:type="pct" w:w="5000"/>
+        <w:tblLook w:firstRow="0" w:lastRow="0" w:firstColumn="0" w:lastColumn="0" w:noHBand="0" w:noVBand="0" w:val="0000"/>
+        <w:jc w:val="start"/>
         <w:tblLayout w:type="fixed"/>
-        <w:tblLook w:firstRow="0" w:lastRow="0" w:firstColumn="0" w:lastColumn="0" w:noHBand="0" w:noVBand="0" w:val="0000"/>
       </w:tblPr>
       <w:tblGrid>
         <w:gridCol w:w="7920"/>
@@ -5859,7 +6659,7 @@
       <w:tr>
         <w:tc>
           <w:tcPr/>
-          <w:bookmarkStart w:id="143" w:name="fig-genecounts-ontLvl"/>
+          <w:bookmarkStart w:id="145" w:name="fig-genecounts-ontLvl"/>
           <w:p>
             <w:pPr>
               <w:pStyle w:val="Compact"/>
@@ -5870,18 +6670,18 @@
                 <wp:inline>
                   <wp:extent cx="5334000" cy="3810000"/>
                   <wp:effectExtent b="0" l="0" r="0" t="0"/>
-                  <wp:docPr descr="" title="" id="141" name="Picture"/>
+                  <wp:docPr descr="" title="" id="143" name="Picture"/>
                   <a:graphic>
                     <a:graphicData uri="http://schemas.openxmlformats.org/drawingml/2006/picture">
                       <pic:pic>
                         <pic:nvPicPr>
-                          <pic:cNvPr descr="manuscript_files/figure-docx/fig-genecounts-ontLvl-1.png" id="142" name="Picture"/>
+                          <pic:cNvPr descr="manuscript_files/figure-docx/fig-genecounts-ontLvl-1.png" id="144" name="Picture"/>
                           <pic:cNvPicPr>
                             <a:picLocks noChangeArrowheads="1" noChangeAspect="1"/>
                           </pic:cNvPicPr>
                         </pic:nvPicPr>
                         <pic:blipFill>
-                          <a:blip r:embed="rId140"/>
+                          <a:blip r:embed="rId142"/>
                           <a:stretch>
                             <a:fillRect/>
                           </a:stretch>
@@ -5913,7 +6713,7 @@
               <w:jc w:val="center"/>
             </w:pPr>
             <w:pPr>
-              <w:jc w:val="left"/>
+              <w:jc w:val="start"/>
               <w:spacing w:before="200"/>
               <w:pStyle w:val="ImageCaption"/>
             </w:pPr>
@@ -5921,18 +6721,19 @@
               <w:t xml:space="preserve">Figure 7: Relationship between ontology level and number of genes associated with each HPO term within that ontology. Lower ontology levels are associated with fewer genes.</w:t>
             </w:r>
           </w:p>
-          <w:bookmarkEnd w:id="143"/>
+          <w:bookmarkEnd w:id="145"/>
         </w:tc>
       </w:tr>
     </w:tbl>
-    <w:bookmarkEnd w:id="144"/>
-    <w:bookmarkStart w:id="149" w:name="cell-fig-ontLvl-distribution"/>
+    <w:bookmarkEnd w:id="146"/>
+    <w:bookmarkStart w:id="151" w:name="cell-fig-ontLvl-distribution"/>
     <w:tbl>
       <w:tblPr>
         <w:tblStyle w:val="Table"/>
         <w:tblW w:type="pct" w:w="5000"/>
+        <w:tblLook w:firstRow="0" w:lastRow="0" w:firstColumn="0" w:lastColumn="0" w:noHBand="0" w:noVBand="0" w:val="0000"/>
+        <w:jc w:val="start"/>
         <w:tblLayout w:type="fixed"/>
-        <w:tblLook w:firstRow="0" w:lastRow="0" w:firstColumn="0" w:lastColumn="0" w:noHBand="0" w:noVBand="0" w:val="0000"/>
       </w:tblPr>
       <w:tblGrid>
         <w:gridCol w:w="7920"/>
@@ -5940,7 +6741,7 @@
       <w:tr>
         <w:tc>
           <w:tcPr/>
-          <w:bookmarkStart w:id="148" w:name="fig-ontLvl-distribution"/>
+          <w:bookmarkStart w:id="150" w:name="fig-ontLvl-distribution"/>
           <w:p>
             <w:pPr>
               <w:pStyle w:val="Compact"/>
@@ -5951,18 +6752,18 @@
                 <wp:inline>
                   <wp:extent cx="5334000" cy="3810000"/>
                   <wp:effectExtent b="0" l="0" r="0" t="0"/>
-                  <wp:docPr descr="" title="" id="146" name="Picture"/>
+                  <wp:docPr descr="" title="" id="148" name="Picture"/>
                   <a:graphic>
                     <a:graphicData uri="http://schemas.openxmlformats.org/drawingml/2006/picture">
                       <pic:pic>
                         <pic:nvPicPr>
-                          <pic:cNvPr descr="manuscript_files/figure-docx/fig-ontLvl-distribution-1.png" id="147" name="Picture"/>
+                          <pic:cNvPr descr="manuscript_files/figure-docx/fig-ontLvl-distribution-1.png" id="149" name="Picture"/>
                           <pic:cNvPicPr>
                             <a:picLocks noChangeArrowheads="1" noChangeAspect="1"/>
                           </pic:cNvPicPr>
                         </pic:nvPicPr>
                         <pic:blipFill>
-                          <a:blip r:embed="rId145"/>
+                          <a:blip r:embed="rId147"/>
                           <a:stretch>
                             <a:fillRect/>
                           </a:stretch>
@@ -5994,7 +6795,7 @@
               <w:jc w:val="center"/>
             </w:pPr>
             <w:pPr>
-              <w:jc w:val="left"/>
+              <w:jc w:val="start"/>
               <w:spacing w:before="200"/>
               <w:pStyle w:val="ImageCaption"/>
             </w:pPr>
@@ -6002,18 +6803,19 @@
               <w:t xml:space="preserve">Figure 8: Distribution of the HPO ontology levels in all phenotypes tested and in the subset used to test annotation consistency.</w:t>
             </w:r>
           </w:p>
-          <w:bookmarkEnd w:id="148"/>
+          <w:bookmarkEnd w:id="150"/>
         </w:tc>
       </w:tr>
     </w:tbl>
-    <w:bookmarkEnd w:id="149"/>
-    <w:bookmarkStart w:id="154" w:name="cell-fig-consist-vs-ontLvl"/>
+    <w:bookmarkEnd w:id="151"/>
+    <w:bookmarkStart w:id="156" w:name="cell-fig-consist-vs-ontLvl"/>
     <w:tbl>
       <w:tblPr>
         <w:tblStyle w:val="Table"/>
         <w:tblW w:type="pct" w:w="5000"/>
+        <w:tblLook w:firstRow="0" w:lastRow="0" w:firstColumn="0" w:lastColumn="0" w:noHBand="0" w:noVBand="0" w:val="0000"/>
+        <w:jc w:val="start"/>
         <w:tblLayout w:type="fixed"/>
-        <w:tblLook w:firstRow="0" w:lastRow="0" w:firstColumn="0" w:lastColumn="0" w:noHBand="0" w:noVBand="0" w:val="0000"/>
       </w:tblPr>
       <w:tblGrid>
         <w:gridCol w:w="7920"/>
@@ -6021,7 +6823,7 @@
       <w:tr>
         <w:tc>
           <w:tcPr/>
-          <w:bookmarkStart w:id="153" w:name="fig-consist-vs-ontLvl"/>
+          <w:bookmarkStart w:id="155" w:name="fig-consist-vs-ontLvl"/>
           <w:p>
             <w:pPr>
               <w:pStyle w:val="Compact"/>
@@ -6032,18 +6834,18 @@
                 <wp:inline>
                   <wp:extent cx="5334000" cy="2667000"/>
                   <wp:effectExtent b="0" l="0" r="0" t="0"/>
-                  <wp:docPr descr="" title="" id="151" name="Picture"/>
+                  <wp:docPr descr="" title="" id="153" name="Picture"/>
                   <a:graphic>
                     <a:graphicData uri="http://schemas.openxmlformats.org/drawingml/2006/picture">
                       <pic:pic>
                         <pic:nvPicPr>
-                          <pic:cNvPr descr="manuscript_files/figure-docx/fig-consist-vs-ontLvl-1.png" id="152" name="Picture"/>
+                          <pic:cNvPr descr="manuscript_files/figure-docx/fig-consist-vs-ontLvl-1.png" id="154" name="Picture"/>
                           <pic:cNvPicPr>
                             <a:picLocks noChangeArrowheads="1" noChangeAspect="1"/>
                           </pic:cNvPicPr>
                         </pic:nvPicPr>
                         <pic:blipFill>
-                          <a:blip r:embed="rId150"/>
+                          <a:blip r:embed="rId152"/>
                           <a:stretch>
                             <a:fillRect/>
                           </a:stretch>
@@ -6075,7 +6877,7 @@
               <w:jc w:val="center"/>
             </w:pPr>
             <w:pPr>
-              <w:jc w:val="left"/>
+              <w:jc w:val="start"/>
               <w:spacing w:before="200"/>
               <w:pStyle w:val="ImageCaption"/>
             </w:pPr>
@@ -6083,18 +6885,19 @@
               <w:t xml:space="preserve">Figure 9: Relationship between the consistency of GPT-4 clinical characterstic annotations (using the stringent criterion) and the level of each phenotype within the HPO ontology (with the number of phenotypes in parentheses). Greater ontology levels (x-axis) indicate more specific phenotypes. The subtitle indicates summary statistics for the overall relationship between HPO level and the proportion of phenotypes that were annotated consistently. The p-values above each bar indicate whether the distribution of consistent/inconsistent annotations, within a given HPO level, significantly deviate from the expected null distribution.</w:t>
             </w:r>
           </w:p>
-          <w:bookmarkEnd w:id="153"/>
+          <w:bookmarkEnd w:id="155"/>
         </w:tc>
       </w:tr>
     </w:tbl>
-    <w:bookmarkEnd w:id="154"/>
-    <w:bookmarkStart w:id="159" w:name="cell-fig-severity-boxplot"/>
+    <w:bookmarkEnd w:id="156"/>
+    <w:bookmarkStart w:id="161" w:name="cell-fig-severity-boxplot"/>
     <w:tbl>
       <w:tblPr>
         <w:tblStyle w:val="Table"/>
         <w:tblW w:type="pct" w:w="5000"/>
+        <w:tblLook w:firstRow="0" w:lastRow="0" w:firstColumn="0" w:lastColumn="0" w:noHBand="0" w:noVBand="0" w:val="0000"/>
+        <w:jc w:val="start"/>
         <w:tblLayout w:type="fixed"/>
-        <w:tblLook w:firstRow="0" w:lastRow="0" w:firstColumn="0" w:lastColumn="0" w:noHBand="0" w:noVBand="0" w:val="0000"/>
       </w:tblPr>
       <w:tblGrid>
         <w:gridCol w:w="7920"/>
@@ -6102,7 +6905,7 @@
       <w:tr>
         <w:tc>
           <w:tcPr/>
-          <w:bookmarkStart w:id="158" w:name="fig-severity-boxplot"/>
+          <w:bookmarkStart w:id="160" w:name="fig-severity-boxplot"/>
           <w:p>
             <w:pPr>
               <w:pStyle w:val="Compact"/>
@@ -6113,18 +6916,18 @@
                 <wp:inline>
                   <wp:extent cx="5334000" cy="3333750"/>
                   <wp:effectExtent b="0" l="0" r="0" t="0"/>
-                  <wp:docPr descr="" title="" id="156" name="Picture"/>
+                  <wp:docPr descr="" title="" id="158" name="Picture"/>
                   <a:graphic>
                     <a:graphicData uri="http://schemas.openxmlformats.org/drawingml/2006/picture">
                       <pic:pic>
                         <pic:nvPicPr>
-                          <pic:cNvPr descr="manuscript_files/figure-docx/fig-severity-boxplot-1.png" id="157" name="Picture"/>
+                          <pic:cNvPr descr="manuscript_files/figure-docx/fig-severity-boxplot-1.png" id="159" name="Picture"/>
                           <pic:cNvPicPr>
                             <a:picLocks noChangeArrowheads="1" noChangeAspect="1"/>
                           </pic:cNvPicPr>
                         </pic:nvPicPr>
                         <pic:blipFill>
-                          <a:blip r:embed="rId155"/>
+                          <a:blip r:embed="rId157"/>
                           <a:stretch>
                             <a:fillRect/>
                           </a:stretch>
@@ -6156,7 +6959,7 @@
               <w:jc w:val="center"/>
             </w:pPr>
             <w:pPr>
-              <w:jc w:val="left"/>
+              <w:jc w:val="start"/>
               <w:spacing w:before="200"/>
               <w:pStyle w:val="ImageCaption"/>
             </w:pPr>
@@ -6164,18 +6967,19 @@
               <w:t xml:space="preserve">Figure 10: Boxplot showing the relationship between composite severity score (y-axis) and the frequency response categories within each clinical characteristic type.</w:t>
             </w:r>
           </w:p>
-          <w:bookmarkEnd w:id="158"/>
+          <w:bookmarkEnd w:id="160"/>
         </w:tc>
       </w:tr>
     </w:tbl>
-    <w:bookmarkEnd w:id="159"/>
-    <w:bookmarkStart w:id="164" w:name="cell-fig-metric-corplot"/>
+    <w:bookmarkEnd w:id="161"/>
+    <w:bookmarkStart w:id="166" w:name="cell-fig-metric-corplot"/>
     <w:tbl>
       <w:tblPr>
         <w:tblStyle w:val="Table"/>
         <w:tblW w:type="pct" w:w="5000"/>
+        <w:tblLook w:firstRow="0" w:lastRow="0" w:firstColumn="0" w:lastColumn="0" w:noHBand="0" w:noVBand="0" w:val="0000"/>
+        <w:jc w:val="start"/>
         <w:tblLayout w:type="fixed"/>
-        <w:tblLook w:firstRow="0" w:lastRow="0" w:firstColumn="0" w:lastColumn="0" w:noHBand="0" w:noVBand="0" w:val="0000"/>
       </w:tblPr>
       <w:tblGrid>
         <w:gridCol w:w="7920"/>
@@ -6183,7 +6987,7 @@
       <w:tr>
         <w:tc>
           <w:tcPr/>
-          <w:bookmarkStart w:id="163" w:name="fig-metric-corplot"/>
+          <w:bookmarkStart w:id="165" w:name="fig-metric-corplot"/>
           <w:p>
             <w:pPr>
               <w:pStyle w:val="Compact"/>
@@ -6194,18 +6998,18 @@
                 <wp:inline>
                   <wp:extent cx="5334000" cy="5334000"/>
                   <wp:effectExtent b="0" l="0" r="0" t="0"/>
-                  <wp:docPr descr="" title="" id="161" name="Picture"/>
+                  <wp:docPr descr="" title="" id="163" name="Picture"/>
                   <a:graphic>
                     <a:graphicData uri="http://schemas.openxmlformats.org/drawingml/2006/picture">
                       <pic:pic>
                         <pic:nvPicPr>
-                          <pic:cNvPr descr="manuscript_files/figure-docx/fig-metric-corplot-1.png" id="162" name="Picture"/>
+                          <pic:cNvPr descr="manuscript_files/figure-docx/fig-metric-corplot-1.png" id="164" name="Picture"/>
                           <pic:cNvPicPr>
                             <a:picLocks noChangeArrowheads="1" noChangeAspect="1"/>
                           </pic:cNvPicPr>
                         </pic:nvPicPr>
                         <pic:blipFill>
-                          <a:blip r:embed="rId160"/>
+                          <a:blip r:embed="rId162"/>
                           <a:stretch>
                             <a:fillRect/>
                           </a:stretch>
@@ -6237,7 +7041,7 @@
               <w:jc w:val="center"/>
             </w:pPr>
             <w:pPr>
-              <w:jc w:val="left"/>
+              <w:jc w:val="start"/>
               <w:spacing w:before="200"/>
               <w:pStyle w:val="ImageCaption"/>
             </w:pPr>
@@ -6245,24 +7049,31 @@
               <w:t xml:space="preserve">Figure 11: Pearson correlations between each individual clinical characteristic severity metric and the composite severity score (</w:t>
             </w:r>
             <w:r>
-              <w:t xml:space="preserve">‘severity_score_gpt’</w:t>
+              <w:t xml:space="preserve">‘</w:t>
+            </w:r>
+            <w:r>
+              <w:t xml:space="preserve">severity_score_gpt</w:t>
+            </w:r>
+            <w:r>
+              <w:t xml:space="preserve">’</w:t>
             </w:r>
             <w:r>
               <w:t xml:space="preserve">).</w:t>
             </w:r>
           </w:p>
-          <w:bookmarkEnd w:id="163"/>
+          <w:bookmarkEnd w:id="165"/>
         </w:tc>
       </w:tr>
     </w:tbl>
-    <w:bookmarkEnd w:id="164"/>
-    <w:bookmarkStart w:id="169" w:name="cell-fig-severity-class"/>
+    <w:bookmarkEnd w:id="166"/>
+    <w:bookmarkStart w:id="171" w:name="cell-fig-severity-class"/>
     <w:tbl>
       <w:tblPr>
         <w:tblStyle w:val="Table"/>
         <w:tblW w:type="pct" w:w="5000"/>
+        <w:tblLook w:firstRow="0" w:lastRow="0" w:firstColumn="0" w:lastColumn="0" w:noHBand="0" w:noVBand="0" w:val="0000"/>
+        <w:jc w:val="start"/>
         <w:tblLayout w:type="fixed"/>
-        <w:tblLook w:firstRow="0" w:lastRow="0" w:firstColumn="0" w:lastColumn="0" w:noHBand="0" w:noVBand="0" w:val="0000"/>
       </w:tblPr>
       <w:tblGrid>
         <w:gridCol w:w="7920"/>
@@ -6270,7 +7081,7 @@
       <w:tr>
         <w:tc>
           <w:tcPr/>
-          <w:bookmarkStart w:id="168" w:name="fig-severity-class"/>
+          <w:bookmarkStart w:id="170" w:name="fig-severity-class"/>
           <w:p>
             <w:pPr>
               <w:pStyle w:val="Compact"/>
@@ -6281,18 +7092,18 @@
                 <wp:inline>
                   <wp:extent cx="5334000" cy="4000500"/>
                   <wp:effectExtent b="0" l="0" r="0" t="0"/>
-                  <wp:docPr descr="" title="" id="166" name="Picture"/>
+                  <wp:docPr descr="" title="" id="168" name="Picture"/>
                   <a:graphic>
                     <a:graphicData uri="http://schemas.openxmlformats.org/drawingml/2006/picture">
                       <pic:pic>
                         <pic:nvPicPr>
-                          <pic:cNvPr descr="manuscript_files/figure-docx/fig-severity-class-1.png" id="167" name="Picture"/>
+                          <pic:cNvPr descr="manuscript_files/figure-docx/fig-severity-class-1.png" id="169" name="Picture"/>
                           <pic:cNvPicPr>
                             <a:picLocks noChangeArrowheads="1" noChangeAspect="1"/>
                           </pic:cNvPicPr>
                         </pic:nvPicPr>
                         <pic:blipFill>
-                          <a:blip r:embed="rId165"/>
+                          <a:blip r:embed="rId167"/>
                           <a:stretch>
                             <a:fillRect/>
                           </a:stretch>
@@ -6324,7 +7135,7 @@
               <w:jc w:val="center"/>
             </w:pPr>
             <w:pPr>
-              <w:jc w:val="left"/>
+              <w:jc w:val="start"/>
               <w:spacing w:before="200"/>
               <w:pStyle w:val="ImageCaption"/>
             </w:pPr>
@@ -6344,18 +7155,18 @@
               <w:t xml:space="preserve">(x-axis). While these are different schemes for ranking phenotype severity, there is a strong correspondence between them (see summary statistics in subtitle). The sample size (number of phenotypes) is shown in parentheses along the x-axis.</w:t>
             </w:r>
           </w:p>
-          <w:bookmarkEnd w:id="168"/>
+          <w:bookmarkEnd w:id="170"/>
         </w:tc>
       </w:tr>
     </w:tbl>
-    <w:bookmarkEnd w:id="169"/>
+    <w:bookmarkEnd w:id="171"/>
     <w:p>
       <w:r>
         <w:br w:type="page"/>
       </w:r>
     </w:p>
-    <w:bookmarkEnd w:id="170"/>
-    <w:bookmarkStart w:id="174" w:name="supplementary-tables"/>
+    <w:bookmarkEnd w:id="172"/>
+    <w:bookmarkStart w:id="176" w:name="supplementary-tables"/>
     <w:p>
       <w:pPr>
         <w:pStyle w:val="Heading3"/>
@@ -6368,8 +7179,9 @@
       <w:tblPr>
         <w:tblStyle w:val="Table"/>
         <w:tblW w:type="pct" w:w="5000"/>
+        <w:tblLook w:firstRow="0" w:lastRow="0" w:firstColumn="0" w:lastColumn="0" w:noHBand="0" w:noVBand="0" w:val="0000"/>
+        <w:jc w:val="start"/>
         <w:tblLayout w:type="fixed"/>
-        <w:tblLook w:firstRow="0" w:lastRow="0" w:firstColumn="0" w:lastColumn="0" w:noHBand="0" w:noVBand="0" w:val="0000"/>
       </w:tblPr>
       <w:tblGrid>
         <w:gridCol w:w="7920"/>
@@ -6377,13 +7189,13 @@
       <w:tr>
         <w:tc>
           <w:tcPr/>
-          <w:bookmarkStart w:id="172" w:name="tbl-annotations"/>
+          <w:bookmarkStart w:id="174" w:name="tbl-annotations"/>
           <w:p>
             <w:pPr>
               <w:jc w:val="center"/>
             </w:pPr>
             <w:pPr>
-              <w:jc w:val="left"/>
+              <w:jc w:val="start"/>
               <w:spacing w:before="200"/>
               <w:pStyle w:val="ImageCaption"/>
             </w:pPr>
@@ -6405,13 +7217,25 @@
               <w:t xml:space="preserve">. For each phenotype, this includes the name of the phenotype (</w:t>
             </w:r>
             <w:r>
-              <w:t xml:space="preserve">‘hpo_name’</w:t>
+              <w:t xml:space="preserve">‘</w:t>
+            </w:r>
+            <w:r>
+              <w:t xml:space="preserve">hpo_name</w:t>
+            </w:r>
+            <w:r>
+              <w:t xml:space="preserve">’</w:t>
             </w:r>
             <w:r>
               <w:t xml:space="preserve">), the ID of the phenotype (</w:t>
             </w:r>
             <w:r>
-              <w:t xml:space="preserve">‘hpo_id’</w:t>
+              <w:t xml:space="preserve">‘</w:t>
+            </w:r>
+            <w:r>
+              <w:t xml:space="preserve">hpo_id</w:t>
+            </w:r>
+            <w:r>
+              <w:t xml:space="preserve">’</w:t>
             </w:r>
             <w:r>
               <w:t xml:space="preserve">), the frequency of each annotation (always, often, rarely, never), and the justification for each annotation (’…_justification’). These results can also be downloaded programmatically using the R function</w:t>
@@ -6433,15 +7257,16 @@
             <w:tblPr>
               <w:tblStyle w:val="Table"/>
               <w:tblW w:type="pct" w:w="5000"/>
+              <w:tblLook w:firstRow="1" w:lastRow="0" w:firstColumn="0" w:lastColumn="0" w:noHBand="0" w:noVBand="0" w:val="0020"/>
+              <w:jc w:val="start"/>
               <w:tblLayout w:type="fixed"/>
-              <w:tblLook w:firstRow="1" w:lastRow="0" w:firstColumn="0" w:lastColumn="0" w:noHBand="0" w:noVBand="0" w:val="0020"/>
             </w:tblPr>
             <w:tblGrid>
               <w:gridCol w:w="7920"/>
             </w:tblGrid>
             <w:tr>
               <w:trPr>
-                <w:tblHeader w:val="on"/>
+                <w:tblHeader w:val="true"/>
               </w:trPr>
               <w:tc>
                 <w:tcPr/>
@@ -6466,7 +7291,7 @@
                     <w:jc w:val="left"/>
                     <w:jc w:val="center"/>
                   </w:pPr>
-                  <w:hyperlink r:id="rId171">
+                  <w:hyperlink r:id="rId173">
                     <w:r>
                       <w:rPr>
                         <w:rStyle w:val="Hyperlink"/>
@@ -6478,7 +7303,7 @@
               </w:tc>
             </w:tr>
           </w:tbl>
-          <w:bookmarkEnd w:id="172"/>
+          <w:bookmarkEnd w:id="174"/>
           <w:p/>
         </w:tc>
       </w:tr>
@@ -6495,8 +7320,9 @@
       <w:tblPr>
         <w:tblStyle w:val="Table"/>
         <w:tblW w:type="pct" w:w="5000"/>
+        <w:tblLook w:firstRow="0" w:lastRow="0" w:firstColumn="0" w:lastColumn="0" w:noHBand="0" w:noVBand="0" w:val="0000"/>
+        <w:jc w:val="start"/>
         <w:tblLayout w:type="fixed"/>
-        <w:tblLook w:firstRow="0" w:lastRow="0" w:firstColumn="0" w:lastColumn="0" w:noHBand="0" w:noVBand="0" w:val="0000"/>
       </w:tblPr>
       <w:tblGrid>
         <w:gridCol w:w="7920"/>
@@ -6504,13 +7330,13 @@
       <w:tr>
         <w:tc>
           <w:tcPr/>
-          <w:bookmarkStart w:id="173" w:name="tbl-fas"/>
+          <w:bookmarkStart w:id="175" w:name="tbl-fas"/>
           <w:p>
             <w:pPr>
               <w:jc w:val="center"/>
             </w:pPr>
             <w:pPr>
-              <w:jc w:val="left"/>
+              <w:jc w:val="start"/>
               <w:spacing w:before="200"/>
               <w:pStyle w:val="ImageCaption"/>
             </w:pPr>
@@ -6521,7 +7347,13 @@
               <w:t xml:space="preserve"> </w:t>
             </w:r>
             <w:r>
-              <w:t xml:space="preserve">‘Fetal akinesia sequence’</w:t>
+              <w:t xml:space="preserve">‘</w:t>
+            </w:r>
+            <w:r>
+              <w:t xml:space="preserve">Fetal akinesia sequence</w:t>
+            </w:r>
+            <w:r>
+              <w:t xml:space="preserve">’</w:t>
             </w:r>
             <w:r>
               <w:t xml:space="preserve"> </w:t>
@@ -6534,8 +7366,9 @@
             <w:tblPr>
               <w:tblStyle w:val="Table"/>
               <w:tblW w:type="pct" w:w="5000"/>
+              <w:tblLook w:firstRow="1" w:lastRow="0" w:firstColumn="0" w:lastColumn="0" w:noHBand="0" w:noVBand="0" w:val="0020"/>
+              <w:jc w:val="start"/>
               <w:tblLayout w:type="fixed"/>
-              <w:tblLook w:firstRow="1" w:lastRow="0" w:firstColumn="0" w:lastColumn="0" w:noHBand="0" w:noVBand="0" w:val="0020"/>
             </w:tblPr>
             <w:tblGrid>
               <w:gridCol w:w="1584"/>
@@ -6544,7 +7377,7 @@
             </w:tblGrid>
             <w:tr>
               <w:trPr>
-                <w:tblHeader w:val="on"/>
+                <w:tblHeader w:val="true"/>
               </w:trPr>
               <w:tc>
                 <w:tcPr/>
@@ -7038,18 +7871,14 @@
               </w:tc>
             </w:tr>
           </w:tbl>
-          <w:bookmarkEnd w:id="173"/>
+          <w:bookmarkEnd w:id="175"/>
           <w:p/>
         </w:tc>
       </w:tr>
     </w:tbl>
-    <w:bookmarkEnd w:id="174"/>
-    <w:bookmarkEnd w:id="175"/>
-    <w:sectPr>
-      <w:footnotePr>
-        <w:numRestart w:val="eachSect"/>
-      </w:footnotePr>
-    </w:sectPr>
+    <w:bookmarkEnd w:id="176"/>
+    <w:bookmarkEnd w:id="177"/>
+    <w:sectPr/>
   </w:body>
 </w:document>
 </file>
@@ -7080,14 +7909,14 @@
 <file path=word/numbering.xml><?xml version="1.0" encoding="utf-8"?>
 <w:numbering xmlns:w="http://schemas.openxmlformats.org/wordprocessingml/2006/main">
   <w:abstractNum w:abstractNumId="990">
-    <w:nsid w:val="0000A990"/>
+    <w:nsid w:val="A990"/>
     <w:multiLevelType w:val="multilevel"/>
     <w:lvl w:ilvl="0">
       <w:numFmt w:val="bullet"/>
       <w:lvlText w:val=" "/>
       <w:lvlJc w:val="left"/>
       <w:pPr>
-        <w:ind w:left="720" w:hanging="360"/>
+        <w:ind w:left="720" w:hanging="480"/>
       </w:pPr>
     </w:lvl>
     <w:lvl w:ilvl="1">
@@ -7095,7 +7924,7 @@
       <w:lvlText w:val=" "/>
       <w:lvlJc w:val="left"/>
       <w:pPr>
-        <w:ind w:left="1440" w:hanging="360"/>
+        <w:ind w:left="1440" w:hanging="480"/>
       </w:pPr>
     </w:lvl>
     <w:lvl w:ilvl="2">
@@ -7103,7 +7932,7 @@
       <w:lvlText w:val=" "/>
       <w:lvlJc w:val="left"/>
       <w:pPr>
-        <w:ind w:left="2160" w:hanging="360"/>
+        <w:ind w:left="2160" w:hanging="480"/>
       </w:pPr>
     </w:lvl>
     <w:lvl w:ilvl="3">
@@ -7111,7 +7940,7 @@
       <w:lvlText w:val=" "/>
       <w:lvlJc w:val="left"/>
       <w:pPr>
-        <w:ind w:left="2880" w:hanging="360"/>
+        <w:ind w:left="2880" w:hanging="480"/>
       </w:pPr>
     </w:lvl>
     <w:lvl w:ilvl="4">
@@ -7119,7 +7948,7 @@
       <w:lvlText w:val=" "/>
       <w:lvlJc w:val="left"/>
       <w:pPr>
-        <w:ind w:left="3600" w:hanging="360"/>
+        <w:ind w:left="3600" w:hanging="480"/>
       </w:pPr>
     </w:lvl>
     <w:lvl w:ilvl="5">
@@ -7127,7 +7956,7 @@
       <w:lvlText w:val=" "/>
       <w:lvlJc w:val="left"/>
       <w:pPr>
-        <w:ind w:left="4320" w:hanging="360"/>
+        <w:ind w:left="4320" w:hanging="480"/>
       </w:pPr>
     </w:lvl>
     <w:lvl w:ilvl="6">
@@ -7135,7 +7964,7 @@
       <w:lvlText w:val=" "/>
       <w:lvlJc w:val="left"/>
       <w:pPr>
-        <w:ind w:left="5040" w:hanging="360"/>
+        <w:ind w:left="5040" w:hanging="480"/>
       </w:pPr>
     </w:lvl>
     <w:lvl w:ilvl="7">
@@ -7143,7 +7972,7 @@
       <w:lvlText w:val=" "/>
       <w:lvlJc w:val="left"/>
       <w:pPr>
-        <w:ind w:left="5760" w:hanging="360"/>
+        <w:ind w:left="5760" w:hanging="480"/>
       </w:pPr>
     </w:lvl>
     <w:lvl w:ilvl="8">
@@ -7151,111 +7980,84 @@
       <w:lvlText w:val=" "/>
       <w:lvlJc w:val="left"/>
       <w:pPr>
-        <w:ind w:left="6480" w:hanging="360"/>
+        <w:ind w:left="6480" w:hanging="480"/>
       </w:pPr>
     </w:lvl>
   </w:abstractNum>
   <w:abstractNum w:abstractNumId="991">
-    <w:nsid w:val="0000A991"/>
+    <w:nsid w:val="A991"/>
     <w:multiLevelType w:val="multilevel"/>
     <w:lvl w:ilvl="0">
       <w:numFmt w:val="bullet"/>
-      <w:lvlText w:val=""/>
+      <w:lvlText w:val="•"/>
       <w:lvlJc w:val="left"/>
       <w:pPr>
-        <w:ind w:left="720" w:hanging="360"/>
-      </w:pPr>
-      <w:rPr>
-        <w:rFonts w:ascii="Symbol" w:hAnsi="Symbol" w:cs="Symbol" w:hint="default"/>
-      </w:rPr>
+        <w:ind w:left="720" w:hanging="480"/>
+      </w:pPr>
     </w:lvl>
     <w:lvl w:ilvl="1">
       <w:numFmt w:val="bullet"/>
-      <w:lvlText w:val="o"/>
+      <w:lvlText w:val="–"/>
       <w:lvlJc w:val="left"/>
       <w:pPr>
-        <w:ind w:left="1440" w:hanging="360"/>
-      </w:pPr>
-      <w:rPr>
-        <w:rFonts w:ascii="Courier New" w:hAnsi="Courier New" w:cs="Courier New" w:hint="default"/>
-      </w:rPr>
+        <w:ind w:left="1440" w:hanging="480"/>
+      </w:pPr>
     </w:lvl>
     <w:lvl w:ilvl="2">
       <w:numFmt w:val="bullet"/>
-      <w:lvlText w:val=""/>
+      <w:lvlText w:val="•"/>
       <w:lvlJc w:val="left"/>
       <w:pPr>
-        <w:ind w:left="2160" w:hanging="360"/>
-      </w:pPr>
-      <w:rPr>
-        <w:rFonts w:ascii="Wingdings" w:hAnsi="Wingdings" w:cs="Wingdings" w:hint="default"/>
-      </w:rPr>
+        <w:ind w:left="2160" w:hanging="480"/>
+      </w:pPr>
     </w:lvl>
     <w:lvl w:ilvl="3">
       <w:numFmt w:val="bullet"/>
-      <w:lvlText w:val=""/>
+      <w:lvlText w:val="–"/>
       <w:lvlJc w:val="left"/>
       <w:pPr>
-        <w:ind w:left="2880" w:hanging="360"/>
-      </w:pPr>
-      <w:rPr>
-        <w:rFonts w:ascii="Symbol" w:hAnsi="Symbol" w:cs="Symbol" w:hint="default"/>
-      </w:rPr>
+        <w:ind w:left="2880" w:hanging="480"/>
+      </w:pPr>
     </w:lvl>
     <w:lvl w:ilvl="4">
       <w:numFmt w:val="bullet"/>
-      <w:lvlText w:val="o"/>
+      <w:lvlText w:val="•"/>
       <w:lvlJc w:val="left"/>
       <w:pPr>
-        <w:ind w:left="3600" w:hanging="360"/>
-      </w:pPr>
-      <w:rPr>
-        <w:rFonts w:ascii="Courier New" w:hAnsi="Courier New" w:cs="Courier New" w:hint="default"/>
-      </w:rPr>
+        <w:ind w:left="3600" w:hanging="480"/>
+      </w:pPr>
     </w:lvl>
     <w:lvl w:ilvl="5">
       <w:numFmt w:val="bullet"/>
-      <w:lvlText w:val=""/>
+      <w:lvlText w:val="–"/>
       <w:lvlJc w:val="left"/>
       <w:pPr>
-        <w:ind w:left="4320" w:hanging="360"/>
-      </w:pPr>
-      <w:rPr>
-        <w:rFonts w:ascii="Wingdings" w:hAnsi="Wingdings" w:cs="Wingdings" w:hint="default"/>
-      </w:rPr>
+        <w:ind w:left="4320" w:hanging="480"/>
+      </w:pPr>
     </w:lvl>
     <w:lvl w:ilvl="6">
       <w:numFmt w:val="bullet"/>
-      <w:lvlText w:val=""/>
+      <w:lvlText w:val="•"/>
       <w:lvlJc w:val="left"/>
       <w:pPr>
-        <w:ind w:left="5040" w:hanging="360"/>
-      </w:pPr>
-      <w:rPr>
-        <w:rFonts w:ascii="Symbol" w:hAnsi="Symbol" w:cs="Symbol" w:hint="default"/>
-      </w:rPr>
+        <w:ind w:left="5040" w:hanging="480"/>
+      </w:pPr>
     </w:lvl>
     <w:lvl w:ilvl="7">
       <w:numFmt w:val="bullet"/>
-      <w:lvlText w:val="o"/>
+      <w:lvlText w:val="–"/>
       <w:lvlJc w:val="left"/>
       <w:pPr>
-        <w:ind w:left="5760" w:hanging="360"/>
-      </w:pPr>
-      <w:rPr>
-        <w:rFonts w:ascii="Courier New" w:hAnsi="Courier New" w:cs="Courier New" w:hint="default"/>
-      </w:rPr>
+        <w:ind w:left="5760" w:hanging="480"/>
+      </w:pPr>
     </w:lvl>
     <w:lvl w:ilvl="8">
       <w:numFmt w:val="bullet"/>
-      <w:lvlText w:val=""/>
+      <w:lvlText w:val="•"/>
       <w:lvlJc w:val="left"/>
       <w:pPr>
-        <w:ind w:left="6480" w:hanging="360"/>
-      </w:pPr>
-      <w:rPr>
-        <w:rFonts w:ascii="Wingdings" w:hAnsi="Wingdings" w:cs="Wingdings" w:hint="default"/>
-      </w:rPr>
+        <w:ind w:left="6480" w:hanging="480"/>
+      </w:pPr>
     </w:lvl>
   </w:abstractNum>
   <w:num w:numId="1000">
@@ -7293,10 +8095,10 @@
     <w:name w:val="Body Text"/>
     <w:basedOn w:val="Normal"/>
     <w:link w:val="BodyTextChar"/>
-    <w:qFormat/>
     <w:pPr>
       <w:spacing w:after="180" w:before="180"/>
     </w:pPr>
+    <w:qFormat/>
   </w:style>
   <w:style w:customStyle="1" w:styleId="FirstParagraph" w:type="paragraph">
     <w:name w:val="First Paragraph"/>
@@ -7316,94 +8118,57 @@
     <w:name w:val="Title"/>
     <w:basedOn w:val="Normal"/>
     <w:next w:val="BodyText"/>
-    <w:link w:val="TitleChar"/>
-    <w:uiPriority w:val="10"/>
     <w:qFormat/>
-    <w:rsid w:val="00A10FD9"/>
     <w:pPr>
-      <w:spacing w:after="80" w:line="240" w:lineRule="auto"/>
-      <w:contextualSpacing/>
+      <w:keepNext/>
+      <w:keepLines/>
+      <w:spacing w:after="240" w:before="480"/>
       <w:jc w:val="center"/>
     </w:pPr>
     <w:rPr>
       <w:rFonts w:asciiTheme="majorHAnsi" w:cstheme="majorBidi" w:eastAsiaTheme="majorEastAsia" w:hAnsiTheme="majorHAnsi"/>
-      <w:sz w:val="56"/>
-      <w:szCs w:val="56"/>
-    </w:rPr>
-  </w:style>
-  <w:style w:customStyle="1" w:styleId="TitleChar" w:type="character">
-    <w:name w:val="Title Char"/>
-    <w:basedOn w:val="DefaultParagraphFont"/>
-    <w:link w:val="Title"/>
-    <w:uiPriority w:val="10"/>
-    <w:rsid w:val="00A10FD9"/>
-    <w:rPr>
-      <w:rFonts w:asciiTheme="majorHAnsi" w:cstheme="majorBidi" w:eastAsiaTheme="majorEastAsia" w:hAnsiTheme="majorHAnsi"/>
-      <w:sz w:val="56"/>
-      <w:szCs w:val="56"/>
+      <w:b/>
+      <w:bCs/>
+      <w:color w:themeColor="accent1" w:themeShade="B5" w:val="345A8A"/>
+      <w:sz w:val="36"/>
+      <w:szCs w:val="36"/>
     </w:rPr>
   </w:style>
   <w:style w:styleId="Subtitle" w:type="paragraph">
     <w:name w:val="Subtitle"/>
     <w:basedOn w:val="Title"/>
     <w:next w:val="BodyText"/>
-    <w:link w:val="SubtitleChar"/>
-    <w:uiPriority w:val="11"/>
     <w:qFormat/>
-    <w:rsid w:val="00A10FD9"/>
     <w:pPr>
-      <w:numPr>
-        <w:ilvl w:val="1"/>
-      </w:numPr>
+      <w:keepNext/>
+      <w:keepLines/>
+      <w:spacing w:after="240" w:before="240"/>
+      <w:jc w:val="center"/>
     </w:pPr>
     <w:rPr>
-      <w:rFonts w:cstheme="majorBidi" w:eastAsiaTheme="majorEastAsia"/>
-      <w:spacing w:val="15"/>
-      <w:sz w:val="28"/>
-      <w:szCs w:val="28"/>
-    </w:rPr>
-  </w:style>
-  <w:style w:customStyle="1" w:styleId="SubtitleChar" w:type="character">
-    <w:name w:val="Subtitle Char"/>
-    <w:basedOn w:val="DefaultParagraphFont"/>
-    <w:link w:val="Subtitle"/>
-    <w:uiPriority w:val="11"/>
-    <w:rsid w:val="00A10FD9"/>
-    <w:rPr>
-      <w:rFonts w:cstheme="majorBidi" w:eastAsiaTheme="majorEastAsia"/>
-      <w:color w:themeColor="text1" w:themeTint="A6" w:val="595959"/>
-      <w:spacing w:val="15"/>
-      <w:sz w:val="28"/>
-      <w:szCs w:val="28"/>
+      <w:sz w:val="30"/>
+      <w:szCs w:val="30"/>
     </w:rPr>
   </w:style>
   <w:style w:customStyle="1" w:styleId="Author" w:type="paragraph">
     <w:name w:val="Author"/>
-    <w:basedOn w:val="Title"/>
     <w:next w:val="BodyText"/>
     <w:qFormat/>
     <w:pPr>
       <w:keepNext/>
       <w:keepLines/>
+      <w:jc w:val="center"/>
     </w:pPr>
-    <w:rPr>
-      <w:sz w:val="24"/>
-      <w:szCs w:val="24"/>
-    </w:rPr>
   </w:style>
   <w:style w:styleId="Date" w:type="paragraph">
     <w:name w:val="Date"/>
-    <w:basedOn w:val="Title"/>
     <w:next w:val="BodyText"/>
     <w:qFormat/>
     <w:pPr>
       <w:keepNext/>
       <w:keepLines/>
+      <w:jc w:val="center"/>
     </w:pPr>
-    <w:rPr>
-      <w:sz w:val="24"/>
-      <w:szCs w:val="24"/>
-    </w:rPr>
   </w:style>
   <w:style w:customStyle="1" w:styleId="AbstractTitle" w:type="paragraph">
     <w:name w:val="Abstract Title"/>
@@ -7413,13 +8178,15 @@
     <w:pPr>
       <w:keepNext/>
       <w:keepLines/>
+      <w:jc w:val="center"/>
       <w:spacing w:after="0" w:before="300"/>
-      <w:jc w:val="center"/>
     </w:pPr>
     <w:rPr>
-      <w:b/>
       <w:sz w:val="20"/>
       <w:szCs w:val="20"/>
+      <w:b/>
+      <w:color w:val="345A8A"/>
+      &gt;
     </w:rPr>
   </w:style>
   <w:style w:customStyle="1" w:styleId="Abstract" w:type="paragraph">
@@ -7446,321 +8213,191 @@
     <w:rPr/>
   </w:style>
   <w:style w:styleId="Heading1" w:type="paragraph">
-    <w:name w:val="heading 1"/>
+    <w:name w:val="Heading 1"/>
     <w:basedOn w:val="Normal"/>
     <w:next w:val="BodyText"/>
-    <w:link w:val="Heading1Char"/>
     <w:uiPriority w:val="9"/>
     <w:qFormat/>
-    <w:rsid w:val="00A10FD9"/>
     <w:pPr>
       <w:keepNext/>
       <w:keepLines/>
-      <w:spacing w:after="80" w:before="360"/>
+      <w:spacing w:after="0" w:before="480"/>
       <w:outlineLvl w:val="0"/>
     </w:pPr>
     <w:rPr>
       <w:rFonts w:asciiTheme="majorHAnsi" w:cstheme="majorBidi" w:eastAsiaTheme="majorEastAsia" w:hAnsiTheme="majorHAnsi"/>
-      <w:color w:themeColor="accent1" w:themeShade="BF" w:val="0F4761"/>
-      <w:sz w:val="40"/>
-      <w:szCs w:val="40"/>
+      <w:b/>
+      <w:bCs/>
+      <w:color w:themeColor="accent1" w:val="4F81BD"/>
+      <w:sz w:val="32"/>
+      <w:szCs w:val="32"/>
     </w:rPr>
   </w:style>
   <w:style w:styleId="Heading2" w:type="paragraph">
-    <w:name w:val="heading 2"/>
+    <w:name w:val="Heading 2"/>
     <w:basedOn w:val="Normal"/>
     <w:next w:val="BodyText"/>
-    <w:link w:val="Heading2Char"/>
     <w:uiPriority w:val="9"/>
-    <w:semiHidden/>
     <w:unhideWhenUsed/>
     <w:qFormat/>
-    <w:rsid w:val="00A10FD9"/>
     <w:pPr>
       <w:keepNext/>
       <w:keepLines/>
-      <w:spacing w:after="80" w:before="160"/>
+      <w:spacing w:after="0" w:before="200"/>
       <w:outlineLvl w:val="1"/>
     </w:pPr>
     <w:rPr>
       <w:rFonts w:asciiTheme="majorHAnsi" w:cstheme="majorBidi" w:eastAsiaTheme="majorEastAsia" w:hAnsiTheme="majorHAnsi"/>
-      <w:color w:themeColor="accent1" w:themeShade="BF" w:val="0F4761"/>
-      <w:sz w:val="32"/>
-      <w:szCs w:val="32"/>
-    </w:rPr>
-  </w:style>
-  <w:style w:styleId="Heading3" w:type="paragraph">
-    <w:name w:val="heading 3"/>
-    <w:basedOn w:val="Normal"/>
-    <w:next w:val="BodyText"/>
-    <w:link w:val="Heading3Char"/>
-    <w:uiPriority w:val="9"/>
-    <w:semiHidden/>
-    <w:unhideWhenUsed/>
-    <w:qFormat/>
-    <w:rsid w:val="00A10FD9"/>
-    <w:pPr>
-      <w:keepNext/>
-      <w:keepLines/>
-      <w:spacing w:after="80" w:before="160"/>
-      <w:outlineLvl w:val="2"/>
-    </w:pPr>
-    <w:rPr>
-      <w:rFonts w:cstheme="majorBidi" w:eastAsiaTheme="majorEastAsia"/>
-      <w:color w:themeColor="accent1" w:themeShade="BF" w:val="0F4761"/>
+      <w:b/>
+      <w:bCs/>
+      <w:color w:themeColor="accent1" w:val="4F81BD"/>
       <w:sz w:val="28"/>
       <w:szCs w:val="28"/>
     </w:rPr>
   </w:style>
-  <w:style w:styleId="Heading4" w:type="paragraph">
-    <w:name w:val="heading 4"/>
+  <w:style w:styleId="Heading3" w:type="paragraph">
+    <w:name w:val="Heading 3"/>
     <w:basedOn w:val="Normal"/>
     <w:next w:val="BodyText"/>
-    <w:link w:val="Heading4Char"/>
     <w:uiPriority w:val="9"/>
-    <w:semiHidden/>
     <w:unhideWhenUsed/>
     <w:qFormat/>
-    <w:rsid w:val="00A10FD9"/>
     <w:pPr>
       <w:keepNext/>
       <w:keepLines/>
-      <w:spacing w:after="40" w:before="80"/>
+      <w:spacing w:after="0" w:before="200"/>
+      <w:outlineLvl w:val="2"/>
+    </w:pPr>
+    <w:rPr>
+      <w:rFonts w:asciiTheme="majorHAnsi" w:cstheme="majorBidi" w:eastAsiaTheme="majorEastAsia" w:hAnsiTheme="majorHAnsi"/>
+      <w:b/>
+      <w:bCs/>
+      <w:color w:themeColor="accent1" w:val="4F81BD"/>
+      <w:sz w:val="24"/>
+      <w:szCs w:val="24"/>
+    </w:rPr>
+  </w:style>
+  <w:style w:styleId="Heading4" w:type="paragraph">
+    <w:name w:val="Heading 4"/>
+    <w:basedOn w:val="Normal"/>
+    <w:next w:val="BodyText"/>
+    <w:uiPriority w:val="9"/>
+    <w:unhideWhenUsed/>
+    <w:qFormat/>
+    <w:pPr>
+      <w:keepNext/>
+      <w:keepLines/>
+      <w:spacing w:after="0" w:before="200"/>
       <w:outlineLvl w:val="3"/>
     </w:pPr>
     <w:rPr>
-      <w:rFonts w:cstheme="majorBidi" w:eastAsiaTheme="majorEastAsia"/>
+      <w:rFonts w:asciiTheme="majorHAnsi" w:cstheme="majorBidi" w:eastAsiaTheme="majorEastAsia" w:hAnsiTheme="majorHAnsi"/>
       <w:i/>
-      <w:iCs/>
-      <w:color w:themeColor="accent1" w:themeShade="BF" w:val="0F4761"/>
+      <w:bCs/>
+      <w:color w:themeColor="accent1" w:val="4F81BD"/>
+      <w:sz w:val="24"/>
+      <w:szCs w:val="24"/>
     </w:rPr>
   </w:style>
   <w:style w:styleId="Heading5" w:type="paragraph">
-    <w:name w:val="heading 5"/>
+    <w:name w:val="Heading 5"/>
     <w:basedOn w:val="Normal"/>
     <w:next w:val="BodyText"/>
-    <w:link w:val="Heading5Char"/>
     <w:uiPriority w:val="9"/>
-    <w:semiHidden/>
     <w:unhideWhenUsed/>
     <w:qFormat/>
-    <w:rsid w:val="00A10FD9"/>
     <w:pPr>
       <w:keepNext/>
       <w:keepLines/>
-      <w:spacing w:after="40" w:before="80"/>
+      <w:spacing w:after="0" w:before="200"/>
       <w:outlineLvl w:val="4"/>
     </w:pPr>
     <w:rPr>
-      <w:rFonts w:cstheme="majorBidi" w:eastAsiaTheme="majorEastAsia"/>
-      <w:color w:themeColor="accent1" w:themeShade="BF" w:val="0F4761"/>
+      <w:rFonts w:asciiTheme="majorHAnsi" w:cstheme="majorBidi" w:eastAsiaTheme="majorEastAsia" w:hAnsiTheme="majorHAnsi"/>
+      <w:iCs/>
+      <w:color w:themeColor="accent1" w:val="4F81BD"/>
+      <w:sz w:val="24"/>
+      <w:szCs w:val="24"/>
     </w:rPr>
   </w:style>
   <w:style w:styleId="Heading6" w:type="paragraph">
-    <w:name w:val="heading 6"/>
+    <w:name w:val="Heading 6"/>
     <w:basedOn w:val="Normal"/>
     <w:next w:val="BodyText"/>
-    <w:link w:val="Heading6Char"/>
     <w:uiPriority w:val="9"/>
-    <w:semiHidden/>
     <w:unhideWhenUsed/>
     <w:qFormat/>
-    <w:rsid w:val="00A10FD9"/>
     <w:pPr>
       <w:keepNext/>
       <w:keepLines/>
-      <w:spacing w:after="0" w:before="40"/>
+      <w:spacing w:after="0" w:before="200"/>
       <w:outlineLvl w:val="5"/>
     </w:pPr>
     <w:rPr>
-      <w:rFonts w:cstheme="majorBidi" w:eastAsiaTheme="majorEastAsia"/>
-      <w:i/>
-      <w:iCs/>
-      <w:color w:themeColor="text1" w:themeTint="A6" w:val="595959"/>
+      <w:rFonts w:asciiTheme="majorHAnsi" w:cstheme="majorBidi" w:eastAsiaTheme="majorEastAsia" w:hAnsiTheme="majorHAnsi"/>
+      <w:color w:themeColor="accent1" w:val="4F81BD"/>
+      <w:sz w:val="24"/>
+      <w:szCs w:val="24"/>
     </w:rPr>
   </w:style>
   <w:style w:styleId="Heading7" w:type="paragraph">
-    <w:name w:val="heading 7"/>
+    <w:name w:val="Heading 7"/>
     <w:basedOn w:val="Normal"/>
     <w:next w:val="BodyText"/>
-    <w:link w:val="Heading7Char"/>
     <w:uiPriority w:val="9"/>
-    <w:semiHidden/>
     <w:unhideWhenUsed/>
     <w:qFormat/>
-    <w:rsid w:val="00A10FD9"/>
     <w:pPr>
       <w:keepNext/>
       <w:keepLines/>
-      <w:spacing w:after="0" w:before="40"/>
+      <w:spacing w:after="0" w:before="200"/>
       <w:outlineLvl w:val="6"/>
     </w:pPr>
     <w:rPr>
-      <w:rFonts w:cstheme="majorBidi" w:eastAsiaTheme="majorEastAsia"/>
-      <w:color w:themeColor="text1" w:themeTint="A6" w:val="595959"/>
+      <w:rFonts w:asciiTheme="majorHAnsi" w:cstheme="majorBidi" w:eastAsiaTheme="majorEastAsia" w:hAnsiTheme="majorHAnsi"/>
+      <w:color w:themeColor="accent1" w:val="4F81BD"/>
+      <w:sz w:val="24"/>
+      <w:szCs w:val="24"/>
     </w:rPr>
   </w:style>
   <w:style w:styleId="Heading8" w:type="paragraph">
-    <w:name w:val="heading 8"/>
+    <w:name w:val="Heading 8"/>
     <w:basedOn w:val="Normal"/>
     <w:next w:val="BodyText"/>
-    <w:link w:val="Heading8Char"/>
     <w:uiPriority w:val="9"/>
-    <w:semiHidden/>
     <w:unhideWhenUsed/>
     <w:qFormat/>
-    <w:rsid w:val="00A10FD9"/>
     <w:pPr>
       <w:keepNext/>
       <w:keepLines/>
-      <w:spacing w:after="0"/>
+      <w:spacing w:after="0" w:before="200"/>
       <w:outlineLvl w:val="7"/>
     </w:pPr>
     <w:rPr>
-      <w:rFonts w:cstheme="majorBidi" w:eastAsiaTheme="majorEastAsia"/>
-      <w:i/>
-      <w:iCs/>
-      <w:color w:themeColor="text1" w:themeTint="D8" w:val="272727"/>
+      <w:rFonts w:asciiTheme="majorHAnsi" w:cstheme="majorBidi" w:eastAsiaTheme="majorEastAsia" w:hAnsiTheme="majorHAnsi"/>
+      <w:color w:themeColor="accent1" w:val="4F81BD"/>
+      <w:sz w:val="24"/>
+      <w:szCs w:val="24"/>
     </w:rPr>
   </w:style>
   <w:style w:styleId="Heading9" w:type="paragraph">
-    <w:name w:val="heading 9"/>
+    <w:name w:val="Heading 9"/>
     <w:basedOn w:val="Normal"/>
     <w:next w:val="BodyText"/>
-    <w:link w:val="Heading9Char"/>
     <w:uiPriority w:val="9"/>
-    <w:semiHidden/>
     <w:unhideWhenUsed/>
     <w:qFormat/>
-    <w:rsid w:val="00A10FD9"/>
     <w:pPr>
       <w:keepNext/>
       <w:keepLines/>
-      <w:spacing w:after="0"/>
+      <w:spacing w:after="0" w:before="200"/>
       <w:outlineLvl w:val="8"/>
     </w:pPr>
     <w:rPr>
-      <w:rFonts w:cstheme="majorBidi" w:eastAsiaTheme="majorEastAsia"/>
-      <w:color w:themeColor="text1" w:themeTint="D8" w:val="272727"/>
-    </w:rPr>
-  </w:style>
-  <w:style w:customStyle="1" w:styleId="Heading1Char" w:type="character">
-    <w:name w:val="Heading 1 Char"/>
-    <w:basedOn w:val="DefaultParagraphFont"/>
-    <w:link w:val="Heading1"/>
-    <w:uiPriority w:val="9"/>
-    <w:rsid w:val="00A10FD9"/>
-    <w:rPr>
       <w:rFonts w:asciiTheme="majorHAnsi" w:cstheme="majorBidi" w:eastAsiaTheme="majorEastAsia" w:hAnsiTheme="majorHAnsi"/>
-      <w:color w:themeColor="accent1" w:themeShade="BF" w:val="0F4761"/>
-      <w:sz w:val="40"/>
-      <w:szCs w:val="40"/>
-    </w:rPr>
-  </w:style>
-  <w:style w:customStyle="1" w:styleId="Heading2Char" w:type="character">
-    <w:name w:val="Heading 2 Char"/>
-    <w:basedOn w:val="DefaultParagraphFont"/>
-    <w:link w:val="Heading2"/>
-    <w:uiPriority w:val="9"/>
-    <w:semiHidden/>
-    <w:rsid w:val="00A10FD9"/>
-    <w:rPr>
-      <w:rFonts w:asciiTheme="majorHAnsi" w:cstheme="majorBidi" w:eastAsiaTheme="majorEastAsia" w:hAnsiTheme="majorHAnsi"/>
-      <w:color w:themeColor="accent1" w:themeShade="BF" w:val="0F4761"/>
-      <w:sz w:val="32"/>
-      <w:szCs w:val="32"/>
-    </w:rPr>
-  </w:style>
-  <w:style w:customStyle="1" w:styleId="Heading3Char" w:type="character">
-    <w:name w:val="Heading 3 Char"/>
-    <w:basedOn w:val="DefaultParagraphFont"/>
-    <w:link w:val="Heading3"/>
-    <w:uiPriority w:val="9"/>
-    <w:semiHidden/>
-    <w:rsid w:val="00A10FD9"/>
-    <w:rPr>
-      <w:rFonts w:cstheme="majorBidi" w:eastAsiaTheme="majorEastAsia"/>
-      <w:color w:themeColor="accent1" w:themeShade="BF" w:val="0F4761"/>
-      <w:sz w:val="28"/>
-      <w:szCs w:val="28"/>
-    </w:rPr>
-  </w:style>
-  <w:style w:customStyle="1" w:styleId="Heading4Char" w:type="character">
-    <w:name w:val="Heading 4 Char"/>
-    <w:basedOn w:val="DefaultParagraphFont"/>
-    <w:link w:val="Heading4"/>
-    <w:uiPriority w:val="9"/>
-    <w:semiHidden/>
-    <w:rsid w:val="00A10FD9"/>
-    <w:rPr>
-      <w:rFonts w:cstheme="majorBidi" w:eastAsiaTheme="majorEastAsia"/>
-      <w:i/>
-      <w:iCs/>
-      <w:color w:themeColor="accent1" w:themeShade="BF" w:val="0F4761"/>
-    </w:rPr>
-  </w:style>
-  <w:style w:customStyle="1" w:styleId="Heading5Char" w:type="character">
-    <w:name w:val="Heading 5 Char"/>
-    <w:basedOn w:val="DefaultParagraphFont"/>
-    <w:link w:val="Heading5"/>
-    <w:uiPriority w:val="9"/>
-    <w:semiHidden/>
-    <w:rsid w:val="00A10FD9"/>
-    <w:rPr>
-      <w:rFonts w:cstheme="majorBidi" w:eastAsiaTheme="majorEastAsia"/>
-      <w:color w:themeColor="accent1" w:themeShade="BF" w:val="0F4761"/>
-    </w:rPr>
-  </w:style>
-  <w:style w:customStyle="1" w:styleId="Heading6Char" w:type="character">
-    <w:name w:val="Heading 6 Char"/>
-    <w:basedOn w:val="DefaultParagraphFont"/>
-    <w:link w:val="Heading6"/>
-    <w:uiPriority w:val="9"/>
-    <w:semiHidden/>
-    <w:rsid w:val="00A10FD9"/>
-    <w:rPr>
-      <w:rFonts w:cstheme="majorBidi" w:eastAsiaTheme="majorEastAsia"/>
-      <w:i/>
-      <w:iCs/>
-      <w:color w:themeColor="text1" w:themeTint="A6" w:val="595959"/>
-    </w:rPr>
-  </w:style>
-  <w:style w:customStyle="1" w:styleId="Heading7Char" w:type="character">
-    <w:name w:val="Heading 7 Char"/>
-    <w:basedOn w:val="DefaultParagraphFont"/>
-    <w:link w:val="Heading7"/>
-    <w:uiPriority w:val="9"/>
-    <w:semiHidden/>
-    <w:rsid w:val="00A10FD9"/>
-    <w:rPr>
-      <w:rFonts w:cstheme="majorBidi" w:eastAsiaTheme="majorEastAsia"/>
-      <w:color w:themeColor="text1" w:themeTint="A6" w:val="595959"/>
-    </w:rPr>
-  </w:style>
-  <w:style w:customStyle="1" w:styleId="Heading8Char" w:type="character">
-    <w:name w:val="Heading 8 Char"/>
-    <w:basedOn w:val="DefaultParagraphFont"/>
-    <w:link w:val="Heading8"/>
-    <w:uiPriority w:val="9"/>
-    <w:semiHidden/>
-    <w:rsid w:val="00A10FD9"/>
-    <w:rPr>
-      <w:rFonts w:cstheme="majorBidi" w:eastAsiaTheme="majorEastAsia"/>
-      <w:i/>
-      <w:iCs/>
-      <w:color w:themeColor="text1" w:themeTint="D8" w:val="272727"/>
-    </w:rPr>
-  </w:style>
-  <w:style w:customStyle="1" w:styleId="Heading9Char" w:type="character">
-    <w:name w:val="Heading 9 Char"/>
-    <w:basedOn w:val="DefaultParagraphFont"/>
-    <w:link w:val="Heading9"/>
-    <w:uiPriority w:val="9"/>
-    <w:semiHidden/>
-    <w:rsid w:val="00A10FD9"/>
-    <w:rPr>
-      <w:rFonts w:cstheme="majorBidi" w:eastAsiaTheme="majorEastAsia"/>
-      <w:color w:themeColor="text1" w:themeTint="D8" w:val="272727"/>
+      <w:color w:themeColor="accent1" w:val="4F81BD"/>
+      <w:sz w:val="24"/>
+      <w:szCs w:val="24"/>
     </w:rPr>
   </w:style>
   <w:style w:styleId="BlockText" w:type="paragraph">
@@ -7785,8 +8422,8 @@
   </w:style>
   <w:style w:styleId="FootnoteBlockText" w:type="paragraph">
     <w:name w:val="Footnote Block Text"/>
-    <w:basedOn w:val="FootnoteText"/>
-    <w:next w:val="FootnoteText"/>
+    <w:basedOn w:val="Footnote Text"/>
+    <w:next w:val="Footnote Text"/>
     <w:uiPriority w:val="9"/>
     <w:unhideWhenUsed/>
     <w:qFormat/>
@@ -7824,10 +8461,10 @@
         <w:jc w:val="left"/>
       </w:trPr>
       <w:tcPr>
+        <w:vAlign w:val="bottom"/>
         <w:tcBorders>
           <w:bottom w:val="single"/>
         </w:tcBorders>
-        <w:vAlign w:val="bottom"/>
       </w:tcPr>
     </w:tblStylePr>
   </w:style>
@@ -7943,7 +8580,6 @@
     <w:name w:val="KeywordTok"/>
     <w:basedOn w:val="VerbatimChar"/>
     <w:rPr>
-      <w:b/>
       <w:color w:val="003b4f"/>
       <w:shd w:val="clear" w:fill="f1f3f5"/>
     </w:rPr>
@@ -8048,9 +8684,9 @@
     <w:name w:val="DocumentationTok"/>
     <w:basedOn w:val="VerbatimChar"/>
     <w:rPr>
-      <w:i/>
       <w:color w:val="5e5e5e"/>
       <w:shd w:val="clear" w:fill="f1f3f5"/>
+      <w:i/>
     </w:rPr>
   </w:style>
   <w:style w:type="character" w:customStyle="1" w:styleId="AnnotationTok">
@@ -8065,9 +8701,9 @@
     <w:name w:val="CommentVarTok"/>
     <w:basedOn w:val="VerbatimChar"/>
     <w:rPr>
-      <w:i/>
       <w:color w:val="5e5e5e"/>
       <w:shd w:val="clear" w:fill="f1f3f5"/>
+      <w:i/>
     </w:rPr>
   </w:style>
   <w:style w:type="character" w:customStyle="1" w:styleId="OtherTok">
@@ -8098,7 +8734,6 @@
     <w:name w:val="ControlFlowTok"/>
     <w:basedOn w:val="VerbatimChar"/>
     <w:rPr>
-      <w:b/>
       <w:color w:val="003b4f"/>
       <w:shd w:val="clear" w:fill="f1f3f5"/>
     </w:rPr>
@@ -8163,9 +8798,9 @@
     <w:name w:val="WarningTok"/>
     <w:basedOn w:val="VerbatimChar"/>
     <w:rPr>
-      <w:i/>
       <w:color w:val="5e5e5e"/>
       <w:shd w:val="clear" w:fill="f1f3f5"/>
+      <w:i/>
     </w:rPr>
   </w:style>
   <w:style w:type="character" w:customStyle="1" w:styleId="AlertTok">
@@ -8206,44 +8841,44 @@
         <a:sysClr val="window" lastClr="FFFFFF"/>
       </a:lt1>
       <a:dk2>
-        <a:srgbClr val="0E2841"/>
+        <a:srgbClr val="1F497D"/>
       </a:dk2>
       <a:lt2>
-        <a:srgbClr val="E8E8E8"/>
+        <a:srgbClr val="EEECE1"/>
       </a:lt2>
       <a:accent1>
-        <a:srgbClr val="156082"/>
+        <a:srgbClr val="4F81BD"/>
       </a:accent1>
       <a:accent2>
-        <a:srgbClr val="E97132"/>
+        <a:srgbClr val="C0504D"/>
       </a:accent2>
       <a:accent3>
-        <a:srgbClr val="196B24"/>
+        <a:srgbClr val="9BBB59"/>
       </a:accent3>
       <a:accent4>
-        <a:srgbClr val="0F9ED5"/>
+        <a:srgbClr val="8064A2"/>
       </a:accent4>
       <a:accent5>
-        <a:srgbClr val="A02B93"/>
+        <a:srgbClr val="4BACC6"/>
       </a:accent5>
       <a:accent6>
-        <a:srgbClr val="4EA72E"/>
+        <a:srgbClr val="F79646"/>
       </a:accent6>
       <a:hlink>
-        <a:srgbClr val="467886"/>
+        <a:srgbClr val="0000FF"/>
       </a:hlink>
       <a:folHlink>
-        <a:srgbClr val="96607D"/>
+        <a:srgbClr val="800080"/>
       </a:folHlink>
     </a:clrScheme>
     <a:fontScheme name="Office">
       <a:majorFont>
-        <a:latin typeface="Aptos Display" panose="02110004020202020204"/>
+        <a:latin typeface="Calibri"/>
         <a:ea typeface=""/>
         <a:cs typeface=""/>
-        <a:font script="Jpan" typeface="游ゴシック Light"/>
+        <a:font script="Jpan" typeface="ＭＳ ゴシック"/>
         <a:font script="Hang" typeface="맑은 고딕"/>
-        <a:font script="Hans" typeface="等线 Light"/>
+        <a:font script="Hans" typeface="宋体"/>
         <a:font script="Hant" typeface="新細明體"/>
         <a:font script="Arab" typeface="Times New Roman"/>
         <a:font script="Hebr" typeface="Times New Roman"/>
@@ -8270,32 +8905,14 @@
         <a:font script="Mong" typeface="Mongolian Baiti"/>
         <a:font script="Viet" typeface="Times New Roman"/>
         <a:font script="Uigh" typeface="Microsoft Uighur"/>
-        <a:font script="Geor" typeface="Sylfaen"/>
-        <a:font script="Armn" typeface="Arial"/>
-        <a:font script="Bugi" typeface="Leelawadee UI"/>
-        <a:font script="Bopo" typeface="Microsoft JhengHei"/>
-        <a:font script="Java" typeface="Javanese Text"/>
-        <a:font script="Lisu" typeface="Segoe UI"/>
-        <a:font script="Mymr" typeface="Myanmar Text"/>
-        <a:font script="Nkoo" typeface="Ebrima"/>
-        <a:font script="Olck" typeface="Nirmala UI"/>
-        <a:font script="Osma" typeface="Ebrima"/>
-        <a:font script="Phag" typeface="Phagspa"/>
-        <a:font script="Syrn" typeface="Estrangelo Edessa"/>
-        <a:font script="Syrj" typeface="Estrangelo Edessa"/>
-        <a:font script="Syre" typeface="Estrangelo Edessa"/>
-        <a:font script="Sora" typeface="Nirmala UI"/>
-        <a:font script="Tale" typeface="Microsoft Tai Le"/>
-        <a:font script="Talu" typeface="Microsoft New Tai Lue"/>
-        <a:font script="Tfng" typeface="Ebrima"/>
       </a:majorFont>
       <a:minorFont>
-        <a:latin typeface="Aptos" panose="02110004020202020204"/>
+        <a:latin typeface="Cambria"/>
         <a:ea typeface=""/>
         <a:cs typeface=""/>
-        <a:font script="Jpan" typeface="游明朝"/>
+        <a:font script="Jpan" typeface="ＭＳ 明朝"/>
         <a:font script="Hang" typeface="맑은 고딕"/>
-        <a:font script="Hans" typeface="等线"/>
+        <a:font script="Hans" typeface="宋体"/>
         <a:font script="Hant" typeface="新細明體"/>
         <a:font script="Arab" typeface="Arial"/>
         <a:font script="Hebr" typeface="Arial"/>
@@ -8322,24 +8939,6 @@
         <a:font script="Mong" typeface="Mongolian Baiti"/>
         <a:font script="Viet" typeface="Arial"/>
         <a:font script="Uigh" typeface="Microsoft Uighur"/>
-        <a:font script="Geor" typeface="Sylfaen"/>
-        <a:font script="Armn" typeface="Arial"/>
-        <a:font script="Bugi" typeface="Leelawadee UI"/>
-        <a:font script="Bopo" typeface="Microsoft JhengHei"/>
-        <a:font script="Java" typeface="Javanese Text"/>
-        <a:font script="Lisu" typeface="Segoe UI"/>
-        <a:font script="Mymr" typeface="Myanmar Text"/>
-        <a:font script="Nkoo" typeface="Ebrima"/>
-        <a:font script="Olck" typeface="Nirmala UI"/>
-        <a:font script="Osma" typeface="Ebrima"/>
-        <a:font script="Phag" typeface="Phagspa"/>
-        <a:font script="Syrn" typeface="Estrangelo Edessa"/>
-        <a:font script="Syrj" typeface="Estrangelo Edessa"/>
-        <a:font script="Syre" typeface="Estrangelo Edessa"/>
-        <a:font script="Sora" typeface="Nirmala UI"/>
-        <a:font script="Tale" typeface="Microsoft Tai Le"/>
-        <a:font script="Talu" typeface="Microsoft New Tai Lue"/>
-        <a:font script="Tfng" typeface="Ebrima"/>
       </a:minorFont>
     </a:fontScheme>
     <a:fmtScheme name="Office">
@@ -8351,141 +8950,200 @@
           <a:gsLst>
             <a:gs pos="0">
               <a:schemeClr val="phClr">
-                <a:lumMod val="110000"/>
-                <a:satMod val="105000"/>
-                <a:tint val="67000"/>
+                <a:tint val="50000"/>
+                <a:satMod val="300000"/>
               </a:schemeClr>
             </a:gs>
-            <a:gs pos="50000">
+            <a:gs pos="35000">
               <a:schemeClr val="phClr">
-                <a:lumMod val="105000"/>
-                <a:satMod val="103000"/>
-                <a:tint val="73000"/>
+                <a:tint val="37000"/>
+                <a:satMod val="300000"/>
               </a:schemeClr>
             </a:gs>
             <a:gs pos="100000">
               <a:schemeClr val="phClr">
-                <a:lumMod val="105000"/>
-                <a:satMod val="109000"/>
-                <a:tint val="81000"/>
+                <a:tint val="15000"/>
+                <a:satMod val="350000"/>
               </a:schemeClr>
             </a:gs>
           </a:gsLst>
-          <a:lin ang="5400000" scaled="0"/>
+          <a:lin ang="16200000" scaled="1"/>
         </a:gradFill>
         <a:gradFill rotWithShape="1">
           <a:gsLst>
             <a:gs pos="0">
               <a:schemeClr val="phClr">
-                <a:satMod val="103000"/>
-                <a:lumMod val="102000"/>
-                <a:tint val="94000"/>
-              </a:schemeClr>
-            </a:gs>
-            <a:gs pos="50000">
-              <a:schemeClr val="phClr">
-                <a:satMod val="110000"/>
-                <a:lumMod val="100000"/>
+                <a:tint val="100000"/>
                 <a:shade val="100000"/>
+                <a:satMod val="130000"/>
               </a:schemeClr>
             </a:gs>
             <a:gs pos="100000">
               <a:schemeClr val="phClr">
-                <a:lumMod val="99000"/>
-                <a:satMod val="120000"/>
-                <a:shade val="78000"/>
+                <a:tint val="50000"/>
+                <a:shade val="100000"/>
+                <a:satMod val="350000"/>
               </a:schemeClr>
             </a:gs>
           </a:gsLst>
-          <a:lin ang="5400000" scaled="0"/>
+          <a:lin ang="16200000" scaled="0"/>
         </a:gradFill>
       </a:fillStyleLst>
       <a:lnStyleLst>
-        <a:ln w="6350" cap="flat" cmpd="sng" algn="ctr">
+        <a:ln w="9525" cap="flat" cmpd="sng" algn="ctr">
+          <a:solidFill>
+            <a:schemeClr val="phClr">
+              <a:shade val="95000"/>
+              <a:satMod val="105000"/>
+            </a:schemeClr>
+          </a:solidFill>
+          <a:prstDash val="solid"/>
+        </a:ln>
+        <a:ln w="25400" cap="flat" cmpd="sng" algn="ctr">
           <a:solidFill>
             <a:schemeClr val="phClr"/>
           </a:solidFill>
           <a:prstDash val="solid"/>
-          <a:miter lim="800000"/>
         </a:ln>
-        <a:ln w="12700" cap="flat" cmpd="sng" algn="ctr">
+        <a:ln w="38100" cap="flat" cmpd="sng" algn="ctr">
           <a:solidFill>
             <a:schemeClr val="phClr"/>
           </a:solidFill>
           <a:prstDash val="solid"/>
-          <a:miter lim="800000"/>
-        </a:ln>
-        <a:ln w="19050" cap="flat" cmpd="sng" algn="ctr">
-          <a:solidFill>
-            <a:schemeClr val="phClr"/>
-          </a:solidFill>
-          <a:prstDash val="solid"/>
-          <a:miter lim="800000"/>
         </a:ln>
       </a:lnStyleLst>
       <a:effectStyleLst>
         <a:effectStyle>
-          <a:effectLst/>
-        </a:effectStyle>
-        <a:effectStyle>
-          <a:effectLst/>
+          <a:effectLst>
+            <a:outerShdw blurRad="40000" dist="20000" dir="5400000" rotWithShape="0">
+              <a:srgbClr val="000000">
+                <a:alpha val="38000"/>
+              </a:srgbClr>
+            </a:outerShdw>
+          </a:effectLst>
         </a:effectStyle>
         <a:effectStyle>
           <a:effectLst>
-            <a:outerShdw blurRad="57150" dist="19050" dir="5400000" algn="ctr" rotWithShape="0">
+            <a:outerShdw blurRad="40000" dist="23000" dir="5400000" rotWithShape="0">
               <a:srgbClr val="000000">
-                <a:alpha val="63000"/>
+                <a:alpha val="35000"/>
               </a:srgbClr>
             </a:outerShdw>
           </a:effectLst>
+        </a:effectStyle>
+        <a:effectStyle>
+          <a:effectLst>
+            <a:outerShdw blurRad="40000" dist="23000" dir="5400000" rotWithShape="0">
+              <a:srgbClr val="000000">
+                <a:alpha val="35000"/>
+              </a:srgbClr>
+            </a:outerShdw>
+          </a:effectLst>
+          <a:scene3d>
+            <a:camera prst="orthographicFront">
+              <a:rot lat="0" lon="0" rev="0"/>
+            </a:camera>
+            <a:lightRig rig="threePt" dir="t">
+              <a:rot lat="0" lon="0" rev="1200000"/>
+            </a:lightRig>
+          </a:scene3d>
+          <a:sp3d>
+            <a:bevelT w="63500" h="25400"/>
+          </a:sp3d>
         </a:effectStyle>
       </a:effectStyleLst>
       <a:bgFillStyleLst>
         <a:solidFill>
           <a:schemeClr val="phClr"/>
         </a:solidFill>
-        <a:solidFill>
-          <a:schemeClr val="phClr">
-            <a:tint val="95000"/>
-            <a:satMod val="170000"/>
-          </a:schemeClr>
-        </a:solidFill>
         <a:gradFill rotWithShape="1">
           <a:gsLst>
             <a:gs pos="0">
               <a:schemeClr val="phClr">
-                <a:tint val="93000"/>
-                <a:satMod val="150000"/>
-                <a:shade val="98000"/>
-                <a:lumMod val="102000"/>
+                <a:tint val="40000"/>
+                <a:satMod val="350000"/>
               </a:schemeClr>
             </a:gs>
-            <a:gs pos="50000">
+            <a:gs pos="40000">
               <a:schemeClr val="phClr">
-                <a:tint val="98000"/>
-                <a:satMod val="130000"/>
-                <a:shade val="90000"/>
-                <a:lumMod val="103000"/>
+                <a:tint val="45000"/>
+                <a:shade val="99000"/>
+                <a:satMod val="350000"/>
               </a:schemeClr>
             </a:gs>
             <a:gs pos="100000">
               <a:schemeClr val="phClr">
-                <a:shade val="63000"/>
-                <a:satMod val="120000"/>
+                <a:shade val="20000"/>
+                <a:satMod val="255000"/>
               </a:schemeClr>
             </a:gs>
           </a:gsLst>
-          <a:lin ang="5400000" scaled="0"/>
+          <a:path path="circle">
+            <a:fillToRect l="50000" t="-80000" r="50000" b="180000"/>
+          </a:path>
+        </a:gradFill>
+        <a:gradFill rotWithShape="1">
+          <a:gsLst>
+            <a:gs pos="0">
+              <a:schemeClr val="phClr">
+                <a:tint val="80000"/>
+                <a:satMod val="300000"/>
+              </a:schemeClr>
+            </a:gs>
+            <a:gs pos="100000">
+              <a:schemeClr val="phClr">
+                <a:shade val="30000"/>
+                <a:satMod val="200000"/>
+              </a:schemeClr>
+            </a:gs>
+          </a:gsLst>
+          <a:path path="circle">
+            <a:fillToRect l="50000" t="50000" r="50000" b="50000"/>
+          </a:path>
         </a:gradFill>
       </a:bgFillStyleLst>
     </a:fmtScheme>
   </a:themeElements>
-  <a:objectDefaults/>
+  <a:objectDefaults>
+    <a:spDef>
+      <a:spPr/>
+      <a:bodyPr/>
+      <a:lstStyle/>
+      <a:style>
+        <a:lnRef idx="1">
+          <a:schemeClr val="accent1"/>
+        </a:lnRef>
+        <a:fillRef idx="3">
+          <a:schemeClr val="accent1"/>
+        </a:fillRef>
+        <a:effectRef idx="2">
+          <a:schemeClr val="accent1"/>
+        </a:effectRef>
+        <a:fontRef idx="minor">
+          <a:schemeClr val="lt1"/>
+        </a:fontRef>
+      </a:style>
+    </a:spDef>
+    <a:lnDef>
+      <a:spPr/>
+      <a:bodyPr/>
+      <a:lstStyle/>
+      <a:style>
+        <a:lnRef idx="2">
+          <a:schemeClr val="accent1"/>
+        </a:lnRef>
+        <a:fillRef idx="0">
+          <a:schemeClr val="accent1"/>
+        </a:fillRef>
+        <a:effectRef idx="1">
+          <a:schemeClr val="accent1"/>
+        </a:effectRef>
+        <a:fontRef idx="minor">
+          <a:schemeClr val="tx1"/>
+        </a:fontRef>
+      </a:style>
+    </a:lnDef>
+  </a:objectDefaults>
   <a:extraClrSchemeLst/>
-  <a:extLst>
-    <a:ext uri="{05A4C25C-085E-4340-85A3-A5531E510DB2}">
-      <thm15:themeFamily xmlns:thm15="http://schemas.microsoft.com/office/thememl/2012/main" name="Office Theme" id="{2E142A2C-CD16-42D6-873A-C26D2A0506FA}" vid="{1BDDFF52-6CD6-40A5-AB3C-68EB2F1E4D0A}"/>
-    </a:ext>
-  </a:extLst>
 </a:theme>
 </file>
</xml_diff>